<commit_message>
Gradient Boosting Tutorials COmpleted.
</commit_message>
<xml_diff>
--- a/AI-NOTES/Examples/Gradient Boosting/Gardient Boosting.docx
+++ b/AI-NOTES/Examples/Gradient Boosting/Gardient Boosting.docx
@@ -33,6 +33,7 @@
       <w:tblPr>
         <w:tblStyle w:val="TableGrid"/>
         <w:tblW w:w="0" w:type="auto"/>
+        <w:jc w:val="center"/>
         <w:tblLook w:val="04A0" w:firstRow="1" w:lastRow="0" w:firstColumn="1" w:lastColumn="0" w:noHBand="0" w:noVBand="1"/>
       </w:tblPr>
       <w:tblGrid>
@@ -44,6 +45,9 @@
         <w:gridCol w:w="1440"/>
       </w:tblGrid>
       <w:tr>
+        <w:trPr>
+          <w:jc w:val="center"/>
+        </w:trPr>
         <w:tc>
           <w:tcPr>
             <w:tcW w:w="1440" w:type="dxa"/>
@@ -172,6 +176,9 @@
         </w:tc>
       </w:tr>
       <w:tr>
+        <w:trPr>
+          <w:jc w:val="center"/>
+        </w:trPr>
         <w:tc>
           <w:tcPr>
             <w:tcW w:w="1440" w:type="dxa"/>
@@ -252,6 +259,9 @@
         </w:tc>
       </w:tr>
       <w:tr>
+        <w:trPr>
+          <w:jc w:val="center"/>
+        </w:trPr>
         <w:tc>
           <w:tcPr>
             <w:tcW w:w="1440" w:type="dxa"/>
@@ -332,6 +342,9 @@
         </w:tc>
       </w:tr>
       <w:tr>
+        <w:trPr>
+          <w:jc w:val="center"/>
+        </w:trPr>
         <w:tc>
           <w:tcPr>
             <w:tcW w:w="1440" w:type="dxa"/>
@@ -412,6 +425,9 @@
         </w:tc>
       </w:tr>
       <w:tr>
+        <w:trPr>
+          <w:jc w:val="center"/>
+        </w:trPr>
         <w:tc>
           <w:tcPr>
             <w:tcW w:w="1440" w:type="dxa"/>
@@ -492,6 +508,9 @@
         </w:tc>
       </w:tr>
       <w:tr>
+        <w:trPr>
+          <w:jc w:val="center"/>
+        </w:trPr>
         <w:tc>
           <w:tcPr>
             <w:tcW w:w="1440" w:type="dxa"/>
@@ -572,6 +591,9 @@
         </w:tc>
       </w:tr>
       <w:tr>
+        <w:trPr>
+          <w:jc w:val="center"/>
+        </w:trPr>
         <w:tc>
           <w:tcPr>
             <w:tcW w:w="1440" w:type="dxa"/>
@@ -652,6 +674,9 @@
         </w:tc>
       </w:tr>
       <w:tr>
+        <w:trPr>
+          <w:jc w:val="center"/>
+        </w:trPr>
         <w:tc>
           <w:tcPr>
             <w:tcW w:w="1440" w:type="dxa"/>
@@ -732,6 +757,9 @@
         </w:tc>
       </w:tr>
       <w:tr>
+        <w:trPr>
+          <w:jc w:val="center"/>
+        </w:trPr>
         <w:tc>
           <w:tcPr>
             <w:tcW w:w="1440" w:type="dxa"/>
@@ -812,6 +840,9 @@
         </w:tc>
       </w:tr>
       <w:tr>
+        <w:trPr>
+          <w:jc w:val="center"/>
+        </w:trPr>
         <w:tc>
           <w:tcPr>
             <w:tcW w:w="1440" w:type="dxa"/>
@@ -892,6 +923,9 @@
         </w:tc>
       </w:tr>
       <w:tr>
+        <w:trPr>
+          <w:jc w:val="center"/>
+        </w:trPr>
         <w:tc>
           <w:tcPr>
             <w:tcW w:w="1440" w:type="dxa"/>
@@ -974,7 +1008,7 @@
     </w:tbl>
     <w:p>
       <w:pPr>
-        <w:jc w:val="center"/>
+        <w:jc w:val="both"/>
       </w:pPr>
       <w:r>
         <w:br/>
@@ -1176,6 +1210,7 @@
     <w:tbl>
       <w:tblPr>
         <w:tblW w:w="0" w:type="auto"/>
+        <w:jc w:val="center"/>
         <w:tblCellSpacing w:w="15" w:type="dxa"/>
         <w:tblCellMar>
           <w:top w:w="15" w:type="dxa"/>
@@ -1198,6 +1233,7 @@
         <w:trPr>
           <w:tblHeader/>
           <w:tblCellSpacing w:w="15" w:type="dxa"/>
+          <w:jc w:val="center"/>
         </w:trPr>
         <w:tc>
           <w:tcPr>
@@ -1441,6 +1477,7 @@
       <w:tr>
         <w:trPr>
           <w:tblCellSpacing w:w="15" w:type="dxa"/>
+          <w:jc w:val="center"/>
         </w:trPr>
         <w:tc>
           <w:tcPr>
@@ -1684,6 +1721,7 @@
       <w:tr>
         <w:trPr>
           <w:tblCellSpacing w:w="15" w:type="dxa"/>
+          <w:jc w:val="center"/>
         </w:trPr>
         <w:tc>
           <w:tcPr>
@@ -1927,6 +1965,7 @@
       <w:tr>
         <w:trPr>
           <w:tblCellSpacing w:w="15" w:type="dxa"/>
+          <w:jc w:val="center"/>
         </w:trPr>
         <w:tc>
           <w:tcPr>
@@ -2170,6 +2209,7 @@
       <w:tr>
         <w:trPr>
           <w:tblCellSpacing w:w="15" w:type="dxa"/>
+          <w:jc w:val="center"/>
         </w:trPr>
         <w:tc>
           <w:tcPr>
@@ -2413,6 +2453,7 @@
       <w:tr>
         <w:trPr>
           <w:tblCellSpacing w:w="15" w:type="dxa"/>
+          <w:jc w:val="center"/>
         </w:trPr>
         <w:tc>
           <w:tcPr>
@@ -2656,6 +2697,7 @@
       <w:tr>
         <w:trPr>
           <w:tblCellSpacing w:w="15" w:type="dxa"/>
+          <w:jc w:val="center"/>
         </w:trPr>
         <w:tc>
           <w:tcPr>
@@ -2899,6 +2941,7 @@
       <w:tr>
         <w:trPr>
           <w:tblCellSpacing w:w="15" w:type="dxa"/>
+          <w:jc w:val="center"/>
         </w:trPr>
         <w:tc>
           <w:tcPr>
@@ -3142,6 +3185,7 @@
       <w:tr>
         <w:trPr>
           <w:tblCellSpacing w:w="15" w:type="dxa"/>
+          <w:jc w:val="center"/>
         </w:trPr>
         <w:tc>
           <w:tcPr>
@@ -3385,6 +3429,7 @@
       <w:tr>
         <w:trPr>
           <w:tblCellSpacing w:w="15" w:type="dxa"/>
+          <w:jc w:val="center"/>
         </w:trPr>
         <w:tc>
           <w:tcPr>
@@ -3628,6 +3673,7 @@
       <w:tr>
         <w:trPr>
           <w:tblCellSpacing w:w="15" w:type="dxa"/>
+          <w:jc w:val="center"/>
         </w:trPr>
         <w:tc>
           <w:tcPr>
@@ -3869,7 +3915,11 @@
         </w:tc>
       </w:tr>
     </w:tbl>
-    <w:p/>
+    <w:p>
+      <w:pPr>
+        <w:jc w:val="both"/>
+      </w:pPr>
+    </w:p>
     <w:p>
       <w:r>
         <w:lastRenderedPageBreak/>
@@ -3986,6 +4036,7 @@
     <w:tbl>
       <w:tblPr>
         <w:tblW w:w="0" w:type="auto"/>
+        <w:jc w:val="center"/>
         <w:tblCellSpacing w:w="15" w:type="dxa"/>
         <w:tblCellMar>
           <w:top w:w="15" w:type="dxa"/>
@@ -4009,10 +4060,11 @@
         <w:trPr>
           <w:tblHeader/>
           <w:tblCellSpacing w:w="15" w:type="dxa"/>
+          <w:jc w:val="center"/>
         </w:trPr>
         <w:tc>
           <w:tcPr>
-            <w:tcW w:w="0" w:type="auto"/>
+            <w:tcW w:w="297" w:type="dxa"/>
             <w:vAlign w:val="center"/>
             <w:hideMark/>
           </w:tcPr>
@@ -4046,7 +4098,7 @@
         </w:tc>
         <w:tc>
           <w:tcPr>
-            <w:tcW w:w="0" w:type="auto"/>
+            <w:tcW w:w="826" w:type="dxa"/>
             <w:vAlign w:val="center"/>
             <w:hideMark/>
           </w:tcPr>
@@ -4080,7 +4132,7 @@
         </w:tc>
         <w:tc>
           <w:tcPr>
-            <w:tcW w:w="0" w:type="auto"/>
+            <w:tcW w:w="1070" w:type="dxa"/>
             <w:vAlign w:val="center"/>
             <w:hideMark/>
           </w:tcPr>
@@ -4114,7 +4166,7 @@
         </w:tc>
         <w:tc>
           <w:tcPr>
-            <w:tcW w:w="0" w:type="auto"/>
+            <w:tcW w:w="993" w:type="dxa"/>
             <w:vAlign w:val="center"/>
             <w:hideMark/>
           </w:tcPr>
@@ -4148,7 +4200,7 @@
         </w:tc>
         <w:tc>
           <w:tcPr>
-            <w:tcW w:w="0" w:type="auto"/>
+            <w:tcW w:w="1154" w:type="dxa"/>
             <w:vAlign w:val="center"/>
             <w:hideMark/>
           </w:tcPr>
@@ -4182,7 +4234,7 @@
         </w:tc>
         <w:tc>
           <w:tcPr>
-            <w:tcW w:w="0" w:type="auto"/>
+            <w:tcW w:w="971" w:type="dxa"/>
             <w:vAlign w:val="center"/>
             <w:hideMark/>
           </w:tcPr>
@@ -4216,7 +4268,7 @@
         </w:tc>
         <w:tc>
           <w:tcPr>
-            <w:tcW w:w="0" w:type="auto"/>
+            <w:tcW w:w="1400" w:type="dxa"/>
             <w:vAlign w:val="center"/>
             <w:hideMark/>
           </w:tcPr>
@@ -4250,7 +4302,7 @@
         </w:tc>
         <w:tc>
           <w:tcPr>
-            <w:tcW w:w="0" w:type="auto"/>
+            <w:tcW w:w="2045" w:type="dxa"/>
             <w:vAlign w:val="center"/>
             <w:hideMark/>
           </w:tcPr>
@@ -4286,10 +4338,11 @@
       <w:tr>
         <w:trPr>
           <w:tblCellSpacing w:w="15" w:type="dxa"/>
+          <w:jc w:val="center"/>
         </w:trPr>
         <w:tc>
           <w:tcPr>
-            <w:tcW w:w="0" w:type="auto"/>
+            <w:tcW w:w="297" w:type="dxa"/>
             <w:vAlign w:val="center"/>
             <w:hideMark/>
           </w:tcPr>
@@ -4323,7 +4376,7 @@
         </w:tc>
         <w:tc>
           <w:tcPr>
-            <w:tcW w:w="0" w:type="auto"/>
+            <w:tcW w:w="826" w:type="dxa"/>
             <w:vAlign w:val="center"/>
             <w:hideMark/>
           </w:tcPr>
@@ -4357,7 +4410,7 @@
         </w:tc>
         <w:tc>
           <w:tcPr>
-            <w:tcW w:w="0" w:type="auto"/>
+            <w:tcW w:w="1070" w:type="dxa"/>
             <w:vAlign w:val="center"/>
             <w:hideMark/>
           </w:tcPr>
@@ -4391,7 +4444,7 @@
         </w:tc>
         <w:tc>
           <w:tcPr>
-            <w:tcW w:w="0" w:type="auto"/>
+            <w:tcW w:w="993" w:type="dxa"/>
             <w:vAlign w:val="center"/>
             <w:hideMark/>
           </w:tcPr>
@@ -4425,7 +4478,7 @@
         </w:tc>
         <w:tc>
           <w:tcPr>
-            <w:tcW w:w="0" w:type="auto"/>
+            <w:tcW w:w="1154" w:type="dxa"/>
             <w:vAlign w:val="center"/>
             <w:hideMark/>
           </w:tcPr>
@@ -4459,7 +4512,7 @@
         </w:tc>
         <w:tc>
           <w:tcPr>
-            <w:tcW w:w="0" w:type="auto"/>
+            <w:tcW w:w="971" w:type="dxa"/>
             <w:vAlign w:val="center"/>
             <w:hideMark/>
           </w:tcPr>
@@ -4493,7 +4546,7 @@
         </w:tc>
         <w:tc>
           <w:tcPr>
-            <w:tcW w:w="0" w:type="auto"/>
+            <w:tcW w:w="1400" w:type="dxa"/>
             <w:vAlign w:val="center"/>
             <w:hideMark/>
           </w:tcPr>
@@ -4527,7 +4580,7 @@
         </w:tc>
         <w:tc>
           <w:tcPr>
-            <w:tcW w:w="0" w:type="auto"/>
+            <w:tcW w:w="2045" w:type="dxa"/>
             <w:vAlign w:val="center"/>
             <w:hideMark/>
           </w:tcPr>
@@ -4563,10 +4616,11 @@
       <w:tr>
         <w:trPr>
           <w:tblCellSpacing w:w="15" w:type="dxa"/>
+          <w:jc w:val="center"/>
         </w:trPr>
         <w:tc>
           <w:tcPr>
-            <w:tcW w:w="0" w:type="auto"/>
+            <w:tcW w:w="297" w:type="dxa"/>
             <w:vAlign w:val="center"/>
             <w:hideMark/>
           </w:tcPr>
@@ -4600,7 +4654,7 @@
         </w:tc>
         <w:tc>
           <w:tcPr>
-            <w:tcW w:w="0" w:type="auto"/>
+            <w:tcW w:w="826" w:type="dxa"/>
             <w:vAlign w:val="center"/>
             <w:hideMark/>
           </w:tcPr>
@@ -4634,7 +4688,7 @@
         </w:tc>
         <w:tc>
           <w:tcPr>
-            <w:tcW w:w="0" w:type="auto"/>
+            <w:tcW w:w="1070" w:type="dxa"/>
             <w:vAlign w:val="center"/>
             <w:hideMark/>
           </w:tcPr>
@@ -4668,7 +4722,7 @@
         </w:tc>
         <w:tc>
           <w:tcPr>
-            <w:tcW w:w="0" w:type="auto"/>
+            <w:tcW w:w="993" w:type="dxa"/>
             <w:vAlign w:val="center"/>
             <w:hideMark/>
           </w:tcPr>
@@ -4702,7 +4756,7 @@
         </w:tc>
         <w:tc>
           <w:tcPr>
-            <w:tcW w:w="0" w:type="auto"/>
+            <w:tcW w:w="1154" w:type="dxa"/>
             <w:vAlign w:val="center"/>
             <w:hideMark/>
           </w:tcPr>
@@ -4736,7 +4790,7 @@
         </w:tc>
         <w:tc>
           <w:tcPr>
-            <w:tcW w:w="0" w:type="auto"/>
+            <w:tcW w:w="971" w:type="dxa"/>
             <w:vAlign w:val="center"/>
             <w:hideMark/>
           </w:tcPr>
@@ -4770,7 +4824,7 @@
         </w:tc>
         <w:tc>
           <w:tcPr>
-            <w:tcW w:w="0" w:type="auto"/>
+            <w:tcW w:w="1400" w:type="dxa"/>
             <w:vAlign w:val="center"/>
             <w:hideMark/>
           </w:tcPr>
@@ -4804,7 +4858,7 @@
         </w:tc>
         <w:tc>
           <w:tcPr>
-            <w:tcW w:w="0" w:type="auto"/>
+            <w:tcW w:w="2045" w:type="dxa"/>
             <w:vAlign w:val="center"/>
             <w:hideMark/>
           </w:tcPr>
@@ -4840,10 +4894,11 @@
       <w:tr>
         <w:trPr>
           <w:tblCellSpacing w:w="15" w:type="dxa"/>
+          <w:jc w:val="center"/>
         </w:trPr>
         <w:tc>
           <w:tcPr>
-            <w:tcW w:w="0" w:type="auto"/>
+            <w:tcW w:w="297" w:type="dxa"/>
             <w:vAlign w:val="center"/>
             <w:hideMark/>
           </w:tcPr>
@@ -4877,7 +4932,7 @@
         </w:tc>
         <w:tc>
           <w:tcPr>
-            <w:tcW w:w="0" w:type="auto"/>
+            <w:tcW w:w="826" w:type="dxa"/>
             <w:vAlign w:val="center"/>
             <w:hideMark/>
           </w:tcPr>
@@ -4911,7 +4966,7 @@
         </w:tc>
         <w:tc>
           <w:tcPr>
-            <w:tcW w:w="0" w:type="auto"/>
+            <w:tcW w:w="1070" w:type="dxa"/>
             <w:vAlign w:val="center"/>
             <w:hideMark/>
           </w:tcPr>
@@ -4945,7 +5000,7 @@
         </w:tc>
         <w:tc>
           <w:tcPr>
-            <w:tcW w:w="0" w:type="auto"/>
+            <w:tcW w:w="993" w:type="dxa"/>
             <w:vAlign w:val="center"/>
             <w:hideMark/>
           </w:tcPr>
@@ -4979,7 +5034,7 @@
         </w:tc>
         <w:tc>
           <w:tcPr>
-            <w:tcW w:w="0" w:type="auto"/>
+            <w:tcW w:w="1154" w:type="dxa"/>
             <w:vAlign w:val="center"/>
             <w:hideMark/>
           </w:tcPr>
@@ -5013,7 +5068,7 @@
         </w:tc>
         <w:tc>
           <w:tcPr>
-            <w:tcW w:w="0" w:type="auto"/>
+            <w:tcW w:w="971" w:type="dxa"/>
             <w:vAlign w:val="center"/>
             <w:hideMark/>
           </w:tcPr>
@@ -5047,7 +5102,7 @@
         </w:tc>
         <w:tc>
           <w:tcPr>
-            <w:tcW w:w="0" w:type="auto"/>
+            <w:tcW w:w="1400" w:type="dxa"/>
             <w:vAlign w:val="center"/>
             <w:hideMark/>
           </w:tcPr>
@@ -5081,7 +5136,7 @@
         </w:tc>
         <w:tc>
           <w:tcPr>
-            <w:tcW w:w="0" w:type="auto"/>
+            <w:tcW w:w="2045" w:type="dxa"/>
             <w:vAlign w:val="center"/>
             <w:hideMark/>
           </w:tcPr>
@@ -5117,10 +5172,11 @@
       <w:tr>
         <w:trPr>
           <w:tblCellSpacing w:w="15" w:type="dxa"/>
+          <w:jc w:val="center"/>
         </w:trPr>
         <w:tc>
           <w:tcPr>
-            <w:tcW w:w="0" w:type="auto"/>
+            <w:tcW w:w="297" w:type="dxa"/>
             <w:vAlign w:val="center"/>
             <w:hideMark/>
           </w:tcPr>
@@ -5154,7 +5210,7 @@
         </w:tc>
         <w:tc>
           <w:tcPr>
-            <w:tcW w:w="0" w:type="auto"/>
+            <w:tcW w:w="826" w:type="dxa"/>
             <w:vAlign w:val="center"/>
             <w:hideMark/>
           </w:tcPr>
@@ -5188,7 +5244,7 @@
         </w:tc>
         <w:tc>
           <w:tcPr>
-            <w:tcW w:w="0" w:type="auto"/>
+            <w:tcW w:w="1070" w:type="dxa"/>
             <w:vAlign w:val="center"/>
             <w:hideMark/>
           </w:tcPr>
@@ -5222,7 +5278,7 @@
         </w:tc>
         <w:tc>
           <w:tcPr>
-            <w:tcW w:w="0" w:type="auto"/>
+            <w:tcW w:w="993" w:type="dxa"/>
             <w:vAlign w:val="center"/>
             <w:hideMark/>
           </w:tcPr>
@@ -5256,7 +5312,7 @@
         </w:tc>
         <w:tc>
           <w:tcPr>
-            <w:tcW w:w="0" w:type="auto"/>
+            <w:tcW w:w="1154" w:type="dxa"/>
             <w:vAlign w:val="center"/>
             <w:hideMark/>
           </w:tcPr>
@@ -5290,7 +5346,7 @@
         </w:tc>
         <w:tc>
           <w:tcPr>
-            <w:tcW w:w="0" w:type="auto"/>
+            <w:tcW w:w="971" w:type="dxa"/>
             <w:vAlign w:val="center"/>
             <w:hideMark/>
           </w:tcPr>
@@ -5324,7 +5380,7 @@
         </w:tc>
         <w:tc>
           <w:tcPr>
-            <w:tcW w:w="0" w:type="auto"/>
+            <w:tcW w:w="1400" w:type="dxa"/>
             <w:vAlign w:val="center"/>
             <w:hideMark/>
           </w:tcPr>
@@ -5358,7 +5414,7 @@
         </w:tc>
         <w:tc>
           <w:tcPr>
-            <w:tcW w:w="0" w:type="auto"/>
+            <w:tcW w:w="2045" w:type="dxa"/>
             <w:vAlign w:val="center"/>
             <w:hideMark/>
           </w:tcPr>
@@ -5394,10 +5450,11 @@
       <w:tr>
         <w:trPr>
           <w:tblCellSpacing w:w="15" w:type="dxa"/>
+          <w:jc w:val="center"/>
         </w:trPr>
         <w:tc>
           <w:tcPr>
-            <w:tcW w:w="0" w:type="auto"/>
+            <w:tcW w:w="297" w:type="dxa"/>
             <w:vAlign w:val="center"/>
             <w:hideMark/>
           </w:tcPr>
@@ -5431,7 +5488,7 @@
         </w:tc>
         <w:tc>
           <w:tcPr>
-            <w:tcW w:w="0" w:type="auto"/>
+            <w:tcW w:w="826" w:type="dxa"/>
             <w:vAlign w:val="center"/>
             <w:hideMark/>
           </w:tcPr>
@@ -5465,7 +5522,7 @@
         </w:tc>
         <w:tc>
           <w:tcPr>
-            <w:tcW w:w="0" w:type="auto"/>
+            <w:tcW w:w="1070" w:type="dxa"/>
             <w:vAlign w:val="center"/>
             <w:hideMark/>
           </w:tcPr>
@@ -5499,7 +5556,7 @@
         </w:tc>
         <w:tc>
           <w:tcPr>
-            <w:tcW w:w="0" w:type="auto"/>
+            <w:tcW w:w="993" w:type="dxa"/>
             <w:vAlign w:val="center"/>
             <w:hideMark/>
           </w:tcPr>
@@ -5533,7 +5590,7 @@
         </w:tc>
         <w:tc>
           <w:tcPr>
-            <w:tcW w:w="0" w:type="auto"/>
+            <w:tcW w:w="1154" w:type="dxa"/>
             <w:vAlign w:val="center"/>
             <w:hideMark/>
           </w:tcPr>
@@ -5567,7 +5624,7 @@
         </w:tc>
         <w:tc>
           <w:tcPr>
-            <w:tcW w:w="0" w:type="auto"/>
+            <w:tcW w:w="971" w:type="dxa"/>
             <w:vAlign w:val="center"/>
             <w:hideMark/>
           </w:tcPr>
@@ -5601,7 +5658,7 @@
         </w:tc>
         <w:tc>
           <w:tcPr>
-            <w:tcW w:w="0" w:type="auto"/>
+            <w:tcW w:w="1400" w:type="dxa"/>
             <w:vAlign w:val="center"/>
             <w:hideMark/>
           </w:tcPr>
@@ -5635,7 +5692,7 @@
         </w:tc>
         <w:tc>
           <w:tcPr>
-            <w:tcW w:w="0" w:type="auto"/>
+            <w:tcW w:w="2045" w:type="dxa"/>
             <w:vAlign w:val="center"/>
             <w:hideMark/>
           </w:tcPr>
@@ -5671,10 +5728,11 @@
       <w:tr>
         <w:trPr>
           <w:tblCellSpacing w:w="15" w:type="dxa"/>
+          <w:jc w:val="center"/>
         </w:trPr>
         <w:tc>
           <w:tcPr>
-            <w:tcW w:w="0" w:type="auto"/>
+            <w:tcW w:w="297" w:type="dxa"/>
             <w:vAlign w:val="center"/>
             <w:hideMark/>
           </w:tcPr>
@@ -5708,7 +5766,7 @@
         </w:tc>
         <w:tc>
           <w:tcPr>
-            <w:tcW w:w="0" w:type="auto"/>
+            <w:tcW w:w="826" w:type="dxa"/>
             <w:vAlign w:val="center"/>
             <w:hideMark/>
           </w:tcPr>
@@ -5742,7 +5800,7 @@
         </w:tc>
         <w:tc>
           <w:tcPr>
-            <w:tcW w:w="0" w:type="auto"/>
+            <w:tcW w:w="1070" w:type="dxa"/>
             <w:vAlign w:val="center"/>
             <w:hideMark/>
           </w:tcPr>
@@ -5776,7 +5834,7 @@
         </w:tc>
         <w:tc>
           <w:tcPr>
-            <w:tcW w:w="0" w:type="auto"/>
+            <w:tcW w:w="993" w:type="dxa"/>
             <w:vAlign w:val="center"/>
             <w:hideMark/>
           </w:tcPr>
@@ -5810,7 +5868,7 @@
         </w:tc>
         <w:tc>
           <w:tcPr>
-            <w:tcW w:w="0" w:type="auto"/>
+            <w:tcW w:w="1154" w:type="dxa"/>
             <w:vAlign w:val="center"/>
             <w:hideMark/>
           </w:tcPr>
@@ -5844,7 +5902,7 @@
         </w:tc>
         <w:tc>
           <w:tcPr>
-            <w:tcW w:w="0" w:type="auto"/>
+            <w:tcW w:w="971" w:type="dxa"/>
             <w:vAlign w:val="center"/>
             <w:hideMark/>
           </w:tcPr>
@@ -5878,7 +5936,7 @@
         </w:tc>
         <w:tc>
           <w:tcPr>
-            <w:tcW w:w="0" w:type="auto"/>
+            <w:tcW w:w="1400" w:type="dxa"/>
             <w:vAlign w:val="center"/>
             <w:hideMark/>
           </w:tcPr>
@@ -5912,7 +5970,7 @@
         </w:tc>
         <w:tc>
           <w:tcPr>
-            <w:tcW w:w="0" w:type="auto"/>
+            <w:tcW w:w="2045" w:type="dxa"/>
             <w:vAlign w:val="center"/>
             <w:hideMark/>
           </w:tcPr>
@@ -5948,10 +6006,11 @@
       <w:tr>
         <w:trPr>
           <w:tblCellSpacing w:w="15" w:type="dxa"/>
+          <w:jc w:val="center"/>
         </w:trPr>
         <w:tc>
           <w:tcPr>
-            <w:tcW w:w="0" w:type="auto"/>
+            <w:tcW w:w="297" w:type="dxa"/>
             <w:vAlign w:val="center"/>
             <w:hideMark/>
           </w:tcPr>
@@ -5985,7 +6044,7 @@
         </w:tc>
         <w:tc>
           <w:tcPr>
-            <w:tcW w:w="0" w:type="auto"/>
+            <w:tcW w:w="826" w:type="dxa"/>
             <w:vAlign w:val="center"/>
             <w:hideMark/>
           </w:tcPr>
@@ -6019,7 +6078,7 @@
         </w:tc>
         <w:tc>
           <w:tcPr>
-            <w:tcW w:w="0" w:type="auto"/>
+            <w:tcW w:w="1070" w:type="dxa"/>
             <w:vAlign w:val="center"/>
             <w:hideMark/>
           </w:tcPr>
@@ -6053,7 +6112,7 @@
         </w:tc>
         <w:tc>
           <w:tcPr>
-            <w:tcW w:w="0" w:type="auto"/>
+            <w:tcW w:w="993" w:type="dxa"/>
             <w:vAlign w:val="center"/>
             <w:hideMark/>
           </w:tcPr>
@@ -6087,7 +6146,7 @@
         </w:tc>
         <w:tc>
           <w:tcPr>
-            <w:tcW w:w="0" w:type="auto"/>
+            <w:tcW w:w="1154" w:type="dxa"/>
             <w:vAlign w:val="center"/>
             <w:hideMark/>
           </w:tcPr>
@@ -6121,7 +6180,7 @@
         </w:tc>
         <w:tc>
           <w:tcPr>
-            <w:tcW w:w="0" w:type="auto"/>
+            <w:tcW w:w="971" w:type="dxa"/>
             <w:vAlign w:val="center"/>
             <w:hideMark/>
           </w:tcPr>
@@ -6155,7 +6214,7 @@
         </w:tc>
         <w:tc>
           <w:tcPr>
-            <w:tcW w:w="0" w:type="auto"/>
+            <w:tcW w:w="1400" w:type="dxa"/>
             <w:vAlign w:val="center"/>
             <w:hideMark/>
           </w:tcPr>
@@ -6189,7 +6248,7 @@
         </w:tc>
         <w:tc>
           <w:tcPr>
-            <w:tcW w:w="0" w:type="auto"/>
+            <w:tcW w:w="2045" w:type="dxa"/>
             <w:vAlign w:val="center"/>
             <w:hideMark/>
           </w:tcPr>
@@ -6225,10 +6284,11 @@
       <w:tr>
         <w:trPr>
           <w:tblCellSpacing w:w="15" w:type="dxa"/>
+          <w:jc w:val="center"/>
         </w:trPr>
         <w:tc>
           <w:tcPr>
-            <w:tcW w:w="0" w:type="auto"/>
+            <w:tcW w:w="297" w:type="dxa"/>
             <w:vAlign w:val="center"/>
             <w:hideMark/>
           </w:tcPr>
@@ -6262,7 +6322,7 @@
         </w:tc>
         <w:tc>
           <w:tcPr>
-            <w:tcW w:w="0" w:type="auto"/>
+            <w:tcW w:w="826" w:type="dxa"/>
             <w:vAlign w:val="center"/>
             <w:hideMark/>
           </w:tcPr>
@@ -6296,7 +6356,7 @@
         </w:tc>
         <w:tc>
           <w:tcPr>
-            <w:tcW w:w="0" w:type="auto"/>
+            <w:tcW w:w="1070" w:type="dxa"/>
             <w:vAlign w:val="center"/>
             <w:hideMark/>
           </w:tcPr>
@@ -6330,7 +6390,7 @@
         </w:tc>
         <w:tc>
           <w:tcPr>
-            <w:tcW w:w="0" w:type="auto"/>
+            <w:tcW w:w="993" w:type="dxa"/>
             <w:vAlign w:val="center"/>
             <w:hideMark/>
           </w:tcPr>
@@ -6364,7 +6424,7 @@
         </w:tc>
         <w:tc>
           <w:tcPr>
-            <w:tcW w:w="0" w:type="auto"/>
+            <w:tcW w:w="1154" w:type="dxa"/>
             <w:vAlign w:val="center"/>
             <w:hideMark/>
           </w:tcPr>
@@ -6398,7 +6458,7 @@
         </w:tc>
         <w:tc>
           <w:tcPr>
-            <w:tcW w:w="0" w:type="auto"/>
+            <w:tcW w:w="971" w:type="dxa"/>
             <w:vAlign w:val="center"/>
             <w:hideMark/>
           </w:tcPr>
@@ -6432,7 +6492,7 @@
         </w:tc>
         <w:tc>
           <w:tcPr>
-            <w:tcW w:w="0" w:type="auto"/>
+            <w:tcW w:w="1400" w:type="dxa"/>
             <w:vAlign w:val="center"/>
             <w:hideMark/>
           </w:tcPr>
@@ -6466,7 +6526,7 @@
         </w:tc>
         <w:tc>
           <w:tcPr>
-            <w:tcW w:w="0" w:type="auto"/>
+            <w:tcW w:w="2045" w:type="dxa"/>
             <w:vAlign w:val="center"/>
             <w:hideMark/>
           </w:tcPr>
@@ -6502,10 +6562,11 @@
       <w:tr>
         <w:trPr>
           <w:tblCellSpacing w:w="15" w:type="dxa"/>
+          <w:jc w:val="center"/>
         </w:trPr>
         <w:tc>
           <w:tcPr>
-            <w:tcW w:w="0" w:type="auto"/>
+            <w:tcW w:w="297" w:type="dxa"/>
             <w:vAlign w:val="center"/>
             <w:hideMark/>
           </w:tcPr>
@@ -6539,7 +6600,7 @@
         </w:tc>
         <w:tc>
           <w:tcPr>
-            <w:tcW w:w="0" w:type="auto"/>
+            <w:tcW w:w="826" w:type="dxa"/>
             <w:vAlign w:val="center"/>
             <w:hideMark/>
           </w:tcPr>
@@ -6573,7 +6634,7 @@
         </w:tc>
         <w:tc>
           <w:tcPr>
-            <w:tcW w:w="0" w:type="auto"/>
+            <w:tcW w:w="1070" w:type="dxa"/>
             <w:vAlign w:val="center"/>
             <w:hideMark/>
           </w:tcPr>
@@ -6607,7 +6668,7 @@
         </w:tc>
         <w:tc>
           <w:tcPr>
-            <w:tcW w:w="0" w:type="auto"/>
+            <w:tcW w:w="993" w:type="dxa"/>
             <w:vAlign w:val="center"/>
             <w:hideMark/>
           </w:tcPr>
@@ -6641,7 +6702,7 @@
         </w:tc>
         <w:tc>
           <w:tcPr>
-            <w:tcW w:w="0" w:type="auto"/>
+            <w:tcW w:w="1154" w:type="dxa"/>
             <w:vAlign w:val="center"/>
             <w:hideMark/>
           </w:tcPr>
@@ -6675,7 +6736,7 @@
         </w:tc>
         <w:tc>
           <w:tcPr>
-            <w:tcW w:w="0" w:type="auto"/>
+            <w:tcW w:w="971" w:type="dxa"/>
             <w:vAlign w:val="center"/>
             <w:hideMark/>
           </w:tcPr>
@@ -6709,7 +6770,7 @@
         </w:tc>
         <w:tc>
           <w:tcPr>
-            <w:tcW w:w="0" w:type="auto"/>
+            <w:tcW w:w="1400" w:type="dxa"/>
             <w:vAlign w:val="center"/>
             <w:hideMark/>
           </w:tcPr>
@@ -6743,7 +6804,7 @@
         </w:tc>
         <w:tc>
           <w:tcPr>
-            <w:tcW w:w="0" w:type="auto"/>
+            <w:tcW w:w="2045" w:type="dxa"/>
             <w:vAlign w:val="center"/>
             <w:hideMark/>
           </w:tcPr>
@@ -6779,10 +6840,11 @@
       <w:tr>
         <w:trPr>
           <w:tblCellSpacing w:w="15" w:type="dxa"/>
+          <w:jc w:val="center"/>
         </w:trPr>
         <w:tc>
           <w:tcPr>
-            <w:tcW w:w="0" w:type="auto"/>
+            <w:tcW w:w="297" w:type="dxa"/>
             <w:vAlign w:val="center"/>
             <w:hideMark/>
           </w:tcPr>
@@ -6816,7 +6878,7 @@
         </w:tc>
         <w:tc>
           <w:tcPr>
-            <w:tcW w:w="0" w:type="auto"/>
+            <w:tcW w:w="826" w:type="dxa"/>
             <w:vAlign w:val="center"/>
             <w:hideMark/>
           </w:tcPr>
@@ -6850,7 +6912,7 @@
         </w:tc>
         <w:tc>
           <w:tcPr>
-            <w:tcW w:w="0" w:type="auto"/>
+            <w:tcW w:w="1070" w:type="dxa"/>
             <w:vAlign w:val="center"/>
             <w:hideMark/>
           </w:tcPr>
@@ -6884,7 +6946,7 @@
         </w:tc>
         <w:tc>
           <w:tcPr>
-            <w:tcW w:w="0" w:type="auto"/>
+            <w:tcW w:w="993" w:type="dxa"/>
             <w:vAlign w:val="center"/>
             <w:hideMark/>
           </w:tcPr>
@@ -6918,7 +6980,7 @@
         </w:tc>
         <w:tc>
           <w:tcPr>
-            <w:tcW w:w="0" w:type="auto"/>
+            <w:tcW w:w="1154" w:type="dxa"/>
             <w:vAlign w:val="center"/>
             <w:hideMark/>
           </w:tcPr>
@@ -6952,7 +7014,7 @@
         </w:tc>
         <w:tc>
           <w:tcPr>
-            <w:tcW w:w="0" w:type="auto"/>
+            <w:tcW w:w="971" w:type="dxa"/>
             <w:vAlign w:val="center"/>
             <w:hideMark/>
           </w:tcPr>
@@ -6986,7 +7048,7 @@
         </w:tc>
         <w:tc>
           <w:tcPr>
-            <w:tcW w:w="0" w:type="auto"/>
+            <w:tcW w:w="1400" w:type="dxa"/>
             <w:vAlign w:val="center"/>
             <w:hideMark/>
           </w:tcPr>
@@ -7020,7 +7082,7 @@
         </w:tc>
         <w:tc>
           <w:tcPr>
-            <w:tcW w:w="0" w:type="auto"/>
+            <w:tcW w:w="2045" w:type="dxa"/>
             <w:vAlign w:val="center"/>
             <w:hideMark/>
           </w:tcPr>
@@ -7054,8 +7116,15 @@
         </w:tc>
       </w:tr>
     </w:tbl>
-    <w:p/>
     <w:p>
+      <w:pPr>
+        <w:jc w:val="both"/>
+      </w:pPr>
+    </w:p>
+    <w:p>
+      <w:pPr>
+        <w:jc w:val="both"/>
+      </w:pPr>
       <w:r>
         <w:t xml:space="preserve">The first decision tree is </w:t>
       </w:r>
@@ -7070,6 +7139,9 @@
       </w:r>
     </w:p>
     <w:p>
+      <w:pPr>
+        <w:jc w:val="both"/>
+      </w:pPr>
       <w:r>
         <w:t>Building the First Decision Tree</w:t>
       </w:r>
@@ -9407,9 +9479,14 @@
         </w:tc>
       </w:tr>
     </w:tbl>
-    <w:p/>
     <w:p>
       <w:pPr>
+        <w:jc w:val="both"/>
+      </w:pPr>
+    </w:p>
+    <w:p>
+      <w:pPr>
+        <w:jc w:val="both"/>
         <w:rPr>
           <w:b/>
           <w:bCs w:val="0"/>
@@ -9418,6 +9495,7 @@
     </w:p>
     <w:p>
       <w:pPr>
+        <w:jc w:val="both"/>
         <w:rPr>
           <w:b/>
           <w:bCs w:val="0"/>
@@ -9426,6 +9504,7 @@
     </w:p>
     <w:p>
       <w:pPr>
+        <w:jc w:val="both"/>
         <w:rPr>
           <w:b/>
           <w:bCs w:val="0"/>
@@ -9434,6 +9513,7 @@
     </w:p>
     <w:p>
       <w:pPr>
+        <w:jc w:val="both"/>
         <w:rPr>
           <w:b/>
           <w:bCs w:val="0"/>
@@ -9442,6 +9522,7 @@
     </w:p>
     <w:p>
       <w:pPr>
+        <w:jc w:val="both"/>
         <w:rPr>
           <w:b/>
           <w:bCs w:val="0"/>
@@ -9494,7 +9575,7 @@
           <w:p>
             <w:pPr>
               <w:spacing w:after="0" w:line="240" w:lineRule="auto"/>
-              <w:jc w:val="right"/>
+              <w:jc w:val="both"/>
               <w:rPr>
                 <w:rFonts w:eastAsia="Times New Roman"/>
                 <w:b/>
@@ -9528,7 +9609,7 @@
           <w:p>
             <w:pPr>
               <w:spacing w:after="0" w:line="240" w:lineRule="auto"/>
-              <w:jc w:val="right"/>
+              <w:jc w:val="both"/>
               <w:rPr>
                 <w:rFonts w:eastAsia="Times New Roman"/>
                 <w:b/>
@@ -10337,7 +10418,7 @@
           <w:p>
             <w:pPr>
               <w:spacing w:after="0" w:line="240" w:lineRule="auto"/>
-              <w:jc w:val="center"/>
+              <w:jc w:val="both"/>
               <w:rPr>
                 <w:rFonts w:eastAsia="Times New Roman"/>
                 <w:b/>
@@ -10371,7 +10452,7 @@
           <w:p>
             <w:pPr>
               <w:spacing w:after="0" w:line="240" w:lineRule="auto"/>
-              <w:jc w:val="right"/>
+              <w:jc w:val="both"/>
               <w:rPr>
                 <w:rFonts w:eastAsia="Times New Roman"/>
                 <w:b/>
@@ -10411,7 +10492,7 @@
           <w:p>
             <w:pPr>
               <w:spacing w:after="0" w:line="240" w:lineRule="auto"/>
-              <w:jc w:val="center"/>
+              <w:jc w:val="both"/>
               <w:rPr>
                 <w:rFonts w:eastAsia="Times New Roman"/>
                 <w:bCs w:val="0"/>
@@ -10445,7 +10526,7 @@
           <w:p>
             <w:pPr>
               <w:spacing w:after="0" w:line="240" w:lineRule="auto"/>
-              <w:jc w:val="center"/>
+              <w:jc w:val="both"/>
               <w:rPr>
                 <w:rFonts w:eastAsia="Times New Roman"/>
                 <w:bCs w:val="0"/>
@@ -10485,7 +10566,7 @@
           <w:p>
             <w:pPr>
               <w:spacing w:after="0" w:line="240" w:lineRule="auto"/>
-              <w:jc w:val="center"/>
+              <w:jc w:val="both"/>
               <w:rPr>
                 <w:rFonts w:eastAsia="Times New Roman"/>
                 <w:bCs w:val="0"/>
@@ -10519,7 +10600,7 @@
           <w:p>
             <w:pPr>
               <w:spacing w:after="0" w:line="240" w:lineRule="auto"/>
-              <w:jc w:val="center"/>
+              <w:jc w:val="both"/>
               <w:rPr>
                 <w:rFonts w:eastAsia="Times New Roman"/>
                 <w:bCs w:val="0"/>
@@ -10559,7 +10640,7 @@
           <w:p>
             <w:pPr>
               <w:spacing w:after="0" w:line="240" w:lineRule="auto"/>
-              <w:jc w:val="center"/>
+              <w:jc w:val="both"/>
               <w:rPr>
                 <w:rFonts w:eastAsia="Times New Roman"/>
                 <w:bCs w:val="0"/>
@@ -10593,7 +10674,7 @@
           <w:p>
             <w:pPr>
               <w:spacing w:after="0" w:line="240" w:lineRule="auto"/>
-              <w:jc w:val="center"/>
+              <w:jc w:val="both"/>
               <w:rPr>
                 <w:rFonts w:eastAsia="Times New Roman"/>
                 <w:bCs w:val="0"/>
@@ -10633,7 +10714,7 @@
           <w:p>
             <w:pPr>
               <w:spacing w:after="0" w:line="240" w:lineRule="auto"/>
-              <w:jc w:val="center"/>
+              <w:jc w:val="both"/>
               <w:rPr>
                 <w:rFonts w:eastAsia="Times New Roman"/>
                 <w:bCs w:val="0"/>
@@ -10667,7 +10748,7 @@
           <w:p>
             <w:pPr>
               <w:spacing w:after="0" w:line="240" w:lineRule="auto"/>
-              <w:jc w:val="center"/>
+              <w:jc w:val="both"/>
               <w:rPr>
                 <w:rFonts w:eastAsia="Times New Roman"/>
                 <w:bCs w:val="0"/>
@@ -10707,7 +10788,7 @@
           <w:p>
             <w:pPr>
               <w:spacing w:after="0" w:line="240" w:lineRule="auto"/>
-              <w:jc w:val="center"/>
+              <w:jc w:val="both"/>
               <w:rPr>
                 <w:rFonts w:eastAsia="Times New Roman"/>
                 <w:bCs w:val="0"/>
@@ -10741,7 +10822,7 @@
           <w:p>
             <w:pPr>
               <w:spacing w:after="0" w:line="240" w:lineRule="auto"/>
-              <w:jc w:val="center"/>
+              <w:jc w:val="both"/>
               <w:rPr>
                 <w:rFonts w:eastAsia="Times New Roman"/>
                 <w:bCs w:val="0"/>
@@ -10781,7 +10862,7 @@
           <w:p>
             <w:pPr>
               <w:spacing w:after="0" w:line="240" w:lineRule="auto"/>
-              <w:jc w:val="center"/>
+              <w:jc w:val="both"/>
               <w:rPr>
                 <w:rFonts w:eastAsia="Times New Roman"/>
                 <w:bCs w:val="0"/>
@@ -10815,7 +10896,7 @@
           <w:p>
             <w:pPr>
               <w:spacing w:after="0" w:line="240" w:lineRule="auto"/>
-              <w:jc w:val="center"/>
+              <w:jc w:val="both"/>
               <w:rPr>
                 <w:rFonts w:eastAsia="Times New Roman"/>
                 <w:bCs w:val="0"/>
@@ -10855,7 +10936,7 @@
           <w:p>
             <w:pPr>
               <w:spacing w:after="0" w:line="240" w:lineRule="auto"/>
-              <w:jc w:val="center"/>
+              <w:jc w:val="both"/>
               <w:rPr>
                 <w:rFonts w:eastAsia="Times New Roman"/>
                 <w:bCs w:val="0"/>
@@ -10889,7 +10970,7 @@
           <w:p>
             <w:pPr>
               <w:spacing w:after="0" w:line="240" w:lineRule="auto"/>
-              <w:jc w:val="center"/>
+              <w:jc w:val="both"/>
               <w:rPr>
                 <w:rFonts w:eastAsia="Times New Roman"/>
                 <w:bCs w:val="0"/>
@@ -10929,7 +11010,7 @@
           <w:p>
             <w:pPr>
               <w:spacing w:after="0" w:line="240" w:lineRule="auto"/>
-              <w:jc w:val="center"/>
+              <w:jc w:val="both"/>
               <w:rPr>
                 <w:rFonts w:eastAsia="Times New Roman"/>
                 <w:bCs w:val="0"/>
@@ -10963,7 +11044,7 @@
           <w:p>
             <w:pPr>
               <w:spacing w:after="0" w:line="240" w:lineRule="auto"/>
-              <w:jc w:val="center"/>
+              <w:jc w:val="both"/>
               <w:rPr>
                 <w:rFonts w:eastAsia="Times New Roman"/>
                 <w:bCs w:val="0"/>
@@ -11003,7 +11084,7 @@
           <w:p>
             <w:pPr>
               <w:spacing w:after="0" w:line="240" w:lineRule="auto"/>
-              <w:jc w:val="center"/>
+              <w:jc w:val="both"/>
               <w:rPr>
                 <w:rFonts w:eastAsia="Times New Roman"/>
                 <w:bCs w:val="0"/>
@@ -11037,7 +11118,7 @@
           <w:p>
             <w:pPr>
               <w:spacing w:after="0" w:line="240" w:lineRule="auto"/>
-              <w:jc w:val="center"/>
+              <w:jc w:val="both"/>
               <w:rPr>
                 <w:rFonts w:eastAsia="Times New Roman"/>
                 <w:bCs w:val="0"/>
@@ -11120,7 +11201,7 @@
           <w:p>
             <w:pPr>
               <w:spacing w:after="0" w:line="240" w:lineRule="auto"/>
-              <w:jc w:val="right"/>
+              <w:jc w:val="both"/>
               <w:rPr>
                 <w:rFonts w:eastAsia="Times New Roman"/>
                 <w:b/>
@@ -11154,7 +11235,7 @@
           <w:p>
             <w:pPr>
               <w:spacing w:after="0" w:line="240" w:lineRule="auto"/>
-              <w:jc w:val="right"/>
+              <w:jc w:val="both"/>
               <w:rPr>
                 <w:rFonts w:eastAsia="Times New Roman"/>
                 <w:b/>
@@ -11194,7 +11275,7 @@
           <w:p>
             <w:pPr>
               <w:spacing w:after="0" w:line="240" w:lineRule="auto"/>
-              <w:jc w:val="right"/>
+              <w:jc w:val="both"/>
               <w:rPr>
                 <w:rFonts w:eastAsia="Times New Roman"/>
                 <w:bCs w:val="0"/>
@@ -11228,7 +11309,7 @@
           <w:p>
             <w:pPr>
               <w:spacing w:after="0" w:line="240" w:lineRule="auto"/>
-              <w:jc w:val="right"/>
+              <w:jc w:val="both"/>
               <w:rPr>
                 <w:rFonts w:eastAsia="Times New Roman"/>
                 <w:bCs w:val="0"/>
@@ -11436,6 +11517,7 @@
     </w:p>
     <w:p>
       <w:pPr>
+        <w:jc w:val="both"/>
         <w:rPr>
           <w:rFonts w:eastAsiaTheme="minorEastAsia"/>
         </w:rPr>
@@ -11509,7 +11591,7 @@
           <w:p>
             <w:pPr>
               <w:spacing w:after="0" w:line="240" w:lineRule="auto"/>
-              <w:jc w:val="right"/>
+              <w:jc w:val="center"/>
               <w:rPr>
                 <w:rFonts w:eastAsia="Times New Roman"/>
                 <w:b/>
@@ -11577,7 +11659,7 @@
           <w:p>
             <w:pPr>
               <w:spacing w:after="0" w:line="240" w:lineRule="auto"/>
-              <w:jc w:val="right"/>
+              <w:jc w:val="center"/>
               <w:rPr>
                 <w:rFonts w:eastAsia="Times New Roman"/>
                 <w:b/>
@@ -11748,6 +11830,7 @@
     </w:tbl>
     <w:p>
       <w:pPr>
+        <w:jc w:val="both"/>
         <w:rPr>
           <w:rFonts w:eastAsiaTheme="minorEastAsia"/>
           <w:b/>
@@ -11801,7 +11884,7 @@
           <w:p>
             <w:pPr>
               <w:spacing w:after="0" w:line="240" w:lineRule="auto"/>
-              <w:jc w:val="right"/>
+              <w:jc w:val="both"/>
               <w:rPr>
                 <w:rFonts w:eastAsia="Times New Roman"/>
                 <w:b/>
@@ -11835,7 +11918,7 @@
           <w:p>
             <w:pPr>
               <w:spacing w:after="0" w:line="240" w:lineRule="auto"/>
-              <w:jc w:val="right"/>
+              <w:jc w:val="both"/>
               <w:rPr>
                 <w:rFonts w:eastAsia="Times New Roman"/>
                 <w:b/>
@@ -11875,7 +11958,7 @@
           <w:p>
             <w:pPr>
               <w:spacing w:after="0" w:line="240" w:lineRule="auto"/>
-              <w:jc w:val="center"/>
+              <w:jc w:val="both"/>
               <w:rPr>
                 <w:rFonts w:eastAsia="Times New Roman"/>
                 <w:bCs w:val="0"/>
@@ -11909,7 +11992,7 @@
           <w:p>
             <w:pPr>
               <w:spacing w:after="0" w:line="240" w:lineRule="auto"/>
-              <w:jc w:val="center"/>
+              <w:jc w:val="both"/>
               <w:rPr>
                 <w:rFonts w:eastAsia="Times New Roman"/>
                 <w:bCs w:val="0"/>
@@ -11949,7 +12032,7 @@
           <w:p>
             <w:pPr>
               <w:spacing w:after="0" w:line="240" w:lineRule="auto"/>
-              <w:jc w:val="center"/>
+              <w:jc w:val="both"/>
               <w:rPr>
                 <w:rFonts w:eastAsia="Times New Roman"/>
                 <w:bCs w:val="0"/>
@@ -11983,7 +12066,7 @@
           <w:p>
             <w:pPr>
               <w:spacing w:after="0" w:line="240" w:lineRule="auto"/>
-              <w:jc w:val="center"/>
+              <w:jc w:val="both"/>
               <w:rPr>
                 <w:rFonts w:eastAsia="Times New Roman"/>
                 <w:bCs w:val="0"/>
@@ -12023,7 +12106,7 @@
           <w:p>
             <w:pPr>
               <w:spacing w:after="0" w:line="240" w:lineRule="auto"/>
-              <w:jc w:val="center"/>
+              <w:jc w:val="both"/>
               <w:rPr>
                 <w:rFonts w:eastAsia="Times New Roman"/>
                 <w:bCs w:val="0"/>
@@ -12057,7 +12140,7 @@
           <w:p>
             <w:pPr>
               <w:spacing w:after="0" w:line="240" w:lineRule="auto"/>
-              <w:jc w:val="center"/>
+              <w:jc w:val="both"/>
               <w:rPr>
                 <w:rFonts w:eastAsia="Times New Roman"/>
                 <w:bCs w:val="0"/>
@@ -12097,7 +12180,7 @@
           <w:p>
             <w:pPr>
               <w:spacing w:after="0" w:line="240" w:lineRule="auto"/>
-              <w:jc w:val="center"/>
+              <w:jc w:val="both"/>
               <w:rPr>
                 <w:rFonts w:eastAsia="Times New Roman"/>
                 <w:bCs w:val="0"/>
@@ -12131,7 +12214,7 @@
           <w:p>
             <w:pPr>
               <w:spacing w:after="0" w:line="240" w:lineRule="auto"/>
-              <w:jc w:val="center"/>
+              <w:jc w:val="both"/>
               <w:rPr>
                 <w:rFonts w:eastAsia="Times New Roman"/>
                 <w:bCs w:val="0"/>
@@ -12171,7 +12254,7 @@
           <w:p>
             <w:pPr>
               <w:spacing w:after="0" w:line="240" w:lineRule="auto"/>
-              <w:jc w:val="center"/>
+              <w:jc w:val="both"/>
               <w:rPr>
                 <w:rFonts w:eastAsia="Times New Roman"/>
                 <w:bCs w:val="0"/>
@@ -12205,7 +12288,7 @@
           <w:p>
             <w:pPr>
               <w:spacing w:after="0" w:line="240" w:lineRule="auto"/>
-              <w:jc w:val="center"/>
+              <w:jc w:val="both"/>
               <w:rPr>
                 <w:rFonts w:eastAsia="Times New Roman"/>
                 <w:bCs w:val="0"/>
@@ -12245,7 +12328,7 @@
           <w:p>
             <w:pPr>
               <w:spacing w:after="0" w:line="240" w:lineRule="auto"/>
-              <w:jc w:val="center"/>
+              <w:jc w:val="both"/>
               <w:rPr>
                 <w:rFonts w:eastAsia="Times New Roman"/>
                 <w:bCs w:val="0"/>
@@ -12279,7 +12362,7 @@
           <w:p>
             <w:pPr>
               <w:spacing w:after="0" w:line="240" w:lineRule="auto"/>
-              <w:jc w:val="center"/>
+              <w:jc w:val="both"/>
               <w:rPr>
                 <w:rFonts w:eastAsia="Times New Roman"/>
                 <w:bCs w:val="0"/>
@@ -12319,7 +12402,7 @@
           <w:p>
             <w:pPr>
               <w:spacing w:after="0" w:line="240" w:lineRule="auto"/>
-              <w:jc w:val="center"/>
+              <w:jc w:val="both"/>
               <w:rPr>
                 <w:rFonts w:eastAsia="Times New Roman"/>
                 <w:bCs w:val="0"/>
@@ -12353,7 +12436,7 @@
           <w:p>
             <w:pPr>
               <w:spacing w:after="0" w:line="240" w:lineRule="auto"/>
-              <w:jc w:val="center"/>
+              <w:jc w:val="both"/>
               <w:rPr>
                 <w:rFonts w:eastAsia="Times New Roman"/>
                 <w:bCs w:val="0"/>
@@ -12393,7 +12476,7 @@
           <w:p>
             <w:pPr>
               <w:spacing w:after="0" w:line="240" w:lineRule="auto"/>
-              <w:jc w:val="center"/>
+              <w:jc w:val="both"/>
               <w:rPr>
                 <w:rFonts w:eastAsia="Times New Roman"/>
                 <w:bCs w:val="0"/>
@@ -12427,7 +12510,7 @@
           <w:p>
             <w:pPr>
               <w:spacing w:after="0" w:line="240" w:lineRule="auto"/>
-              <w:jc w:val="center"/>
+              <w:jc w:val="both"/>
               <w:rPr>
                 <w:rFonts w:eastAsia="Times New Roman"/>
                 <w:bCs w:val="0"/>
@@ -12467,7 +12550,7 @@
           <w:p>
             <w:pPr>
               <w:spacing w:after="0" w:line="240" w:lineRule="auto"/>
-              <w:jc w:val="center"/>
+              <w:jc w:val="both"/>
               <w:rPr>
                 <w:rFonts w:eastAsia="Times New Roman"/>
                 <w:bCs w:val="0"/>
@@ -12501,7 +12584,7 @@
           <w:p>
             <w:pPr>
               <w:spacing w:after="0" w:line="240" w:lineRule="auto"/>
-              <w:jc w:val="center"/>
+              <w:jc w:val="both"/>
               <w:rPr>
                 <w:rFonts w:eastAsia="Times New Roman"/>
                 <w:bCs w:val="0"/>
@@ -12530,6 +12613,7 @@
     </w:tbl>
     <w:p>
       <w:pPr>
+        <w:jc w:val="both"/>
         <w:rPr>
           <w:rFonts w:eastAsiaTheme="minorEastAsia"/>
         </w:rPr>
@@ -12537,6 +12621,7 @@
     </w:p>
     <w:p>
       <w:pPr>
+        <w:jc w:val="both"/>
         <w:rPr>
           <w:rFonts w:eastAsiaTheme="minorEastAsia"/>
         </w:rPr>
@@ -12550,6 +12635,7 @@
     </w:p>
     <w:p>
       <w:pPr>
+        <w:jc w:val="both"/>
         <w:rPr>
           <w:rFonts w:eastAsiaTheme="minorEastAsia"/>
         </w:rPr>
@@ -12648,6 +12734,7 @@
     </w:p>
     <w:p>
       <w:pPr>
+        <w:jc w:val="both"/>
         <w:rPr>
           <w:rFonts w:eastAsiaTheme="minorEastAsia"/>
         </w:rPr>
@@ -12726,6 +12813,7 @@
     </w:p>
     <w:p>
       <w:pPr>
+        <w:jc w:val="both"/>
         <w:rPr>
           <w:rFonts w:eastAsiaTheme="minorEastAsia"/>
         </w:rPr>
@@ -12739,6 +12827,7 @@
     </w:p>
     <w:p>
       <w:pPr>
+        <w:jc w:val="both"/>
         <w:rPr>
           <w:rFonts w:eastAsiaTheme="minorEastAsia"/>
         </w:rPr>
@@ -12838,7 +12927,7 @@
           <w:p>
             <w:pPr>
               <w:spacing w:after="0" w:line="240" w:lineRule="auto"/>
-              <w:jc w:val="right"/>
+              <w:jc w:val="both"/>
               <w:rPr>
                 <w:rFonts w:eastAsia="Times New Roman"/>
                 <w:b/>
@@ -12872,7 +12961,7 @@
           <w:p>
             <w:pPr>
               <w:spacing w:after="0" w:line="240" w:lineRule="auto"/>
-              <w:jc w:val="right"/>
+              <w:jc w:val="both"/>
               <w:rPr>
                 <w:rFonts w:eastAsia="Times New Roman"/>
                 <w:b/>
@@ -12906,7 +12995,7 @@
           <w:p>
             <w:pPr>
               <w:spacing w:after="0" w:line="240" w:lineRule="auto"/>
-              <w:jc w:val="center"/>
+              <w:jc w:val="both"/>
               <w:rPr>
                 <w:rFonts w:eastAsia="Times New Roman"/>
                 <w:b/>
@@ -12940,7 +13029,7 @@
           <w:p>
             <w:pPr>
               <w:spacing w:after="0" w:line="240" w:lineRule="auto"/>
-              <w:jc w:val="right"/>
+              <w:jc w:val="both"/>
               <w:rPr>
                 <w:rFonts w:eastAsia="Times New Roman"/>
                 <w:b/>
@@ -14247,6 +14336,7 @@
     </w:tbl>
     <w:p>
       <w:pPr>
+        <w:jc w:val="both"/>
         <w:rPr>
           <w:rFonts w:eastAsiaTheme="minorEastAsia"/>
         </w:rPr>
@@ -14277,6 +14367,7 @@
     </w:p>
     <w:p>
       <w:pPr>
+        <w:jc w:val="both"/>
         <w:rPr>
           <w:rFonts w:eastAsiaTheme="minorEastAsia"/>
         </w:rPr>
@@ -14294,6 +14385,7 @@
     </w:p>
     <w:p>
       <w:pPr>
+        <w:jc w:val="both"/>
         <w:rPr>
           <w:rFonts w:eastAsiaTheme="minorEastAsia"/>
         </w:rPr>
@@ -14315,6 +14407,7 @@
     </w:p>
     <w:p>
       <w:pPr>
+        <w:jc w:val="both"/>
         <w:rPr>
           <w:rFonts w:eastAsiaTheme="minorEastAsia"/>
         </w:rPr>
@@ -14365,6 +14458,7 @@
     </w:p>
     <w:p>
       <w:pPr>
+        <w:jc w:val="both"/>
         <w:rPr>
           <w:rFonts w:eastAsiaTheme="minorEastAsia"/>
         </w:rPr>
@@ -14382,6 +14476,7 @@
     </w:p>
     <w:p>
       <w:pPr>
+        <w:jc w:val="both"/>
         <w:rPr>
           <w:rFonts w:eastAsiaTheme="minorEastAsia"/>
         </w:rPr>
@@ -14464,7 +14559,7 @@
           <w:p>
             <w:pPr>
               <w:spacing w:after="0" w:line="240" w:lineRule="auto"/>
-              <w:jc w:val="center"/>
+              <w:jc w:val="both"/>
               <w:rPr>
                 <w:rFonts w:eastAsia="Times New Roman"/>
                 <w:b/>
@@ -14498,7 +14593,7 @@
           <w:p>
             <w:pPr>
               <w:spacing w:after="0" w:line="240" w:lineRule="auto"/>
-              <w:jc w:val="center"/>
+              <w:jc w:val="both"/>
               <w:rPr>
                 <w:rFonts w:eastAsia="Times New Roman"/>
                 <w:b/>
@@ -14532,7 +14627,7 @@
           <w:p>
             <w:pPr>
               <w:spacing w:after="0" w:line="240" w:lineRule="auto"/>
-              <w:jc w:val="center"/>
+              <w:jc w:val="both"/>
               <w:rPr>
                 <w:rFonts w:eastAsia="Times New Roman"/>
                 <w:b/>
@@ -14566,7 +14661,7 @@
           <w:p>
             <w:pPr>
               <w:spacing w:after="0" w:line="240" w:lineRule="auto"/>
-              <w:jc w:val="center"/>
+              <w:jc w:val="both"/>
               <w:rPr>
                 <w:rFonts w:eastAsia="Times New Roman"/>
                 <w:b/>
@@ -14600,7 +14695,7 @@
           <w:p>
             <w:pPr>
               <w:spacing w:after="0" w:line="240" w:lineRule="auto"/>
-              <w:jc w:val="center"/>
+              <w:jc w:val="both"/>
               <w:rPr>
                 <w:rFonts w:eastAsia="Times New Roman"/>
                 <w:b/>
@@ -14634,7 +14729,7 @@
           <w:p>
             <w:pPr>
               <w:spacing w:after="0" w:line="240" w:lineRule="auto"/>
-              <w:jc w:val="center"/>
+              <w:jc w:val="both"/>
               <w:rPr>
                 <w:rFonts w:eastAsia="Times New Roman"/>
                 <w:b/>
@@ -14674,7 +14769,7 @@
           <w:p>
             <w:pPr>
               <w:spacing w:after="0" w:line="240" w:lineRule="auto"/>
-              <w:jc w:val="center"/>
+              <w:jc w:val="both"/>
               <w:rPr>
                 <w:rFonts w:eastAsia="Times New Roman"/>
                 <w:bCs w:val="0"/>
@@ -14735,7 +14830,7 @@
           <w:p>
             <w:pPr>
               <w:spacing w:after="0" w:line="240" w:lineRule="auto"/>
-              <w:jc w:val="center"/>
+              <w:jc w:val="both"/>
               <w:rPr>
                 <w:rFonts w:eastAsia="Times New Roman"/>
                 <w:bCs w:val="0"/>
@@ -14769,7 +14864,7 @@
           <w:p>
             <w:pPr>
               <w:spacing w:after="0" w:line="240" w:lineRule="auto"/>
-              <w:jc w:val="center"/>
+              <w:jc w:val="both"/>
               <w:rPr>
                 <w:rFonts w:eastAsia="Times New Roman"/>
                 <w:bCs w:val="0"/>
@@ -14803,7 +14898,7 @@
           <w:p>
             <w:pPr>
               <w:spacing w:after="0" w:line="240" w:lineRule="auto"/>
-              <w:jc w:val="center"/>
+              <w:jc w:val="both"/>
               <w:rPr>
                 <w:rFonts w:eastAsia="Times New Roman"/>
                 <w:bCs w:val="0"/>
@@ -14837,7 +14932,7 @@
           <w:p>
             <w:pPr>
               <w:spacing w:after="0" w:line="240" w:lineRule="auto"/>
-              <w:jc w:val="center"/>
+              <w:jc w:val="both"/>
               <w:rPr>
                 <w:rFonts w:eastAsia="Times New Roman"/>
                 <w:bCs w:val="0"/>
@@ -14871,7 +14966,7 @@
           <w:p>
             <w:pPr>
               <w:spacing w:after="0" w:line="240" w:lineRule="auto"/>
-              <w:jc w:val="center"/>
+              <w:jc w:val="both"/>
               <w:rPr>
                 <w:rFonts w:eastAsia="Times New Roman"/>
                 <w:bCs w:val="0"/>
@@ -14911,7 +15006,7 @@
           <w:p>
             <w:pPr>
               <w:spacing w:after="0" w:line="240" w:lineRule="auto"/>
-              <w:jc w:val="center"/>
+              <w:jc w:val="both"/>
               <w:rPr>
                 <w:rFonts w:eastAsia="Times New Roman"/>
                 <w:bCs w:val="0"/>
@@ -14946,7 +15041,7 @@
           <w:p>
             <w:pPr>
               <w:spacing w:after="0" w:line="240" w:lineRule="auto"/>
-              <w:jc w:val="center"/>
+              <w:jc w:val="both"/>
               <w:rPr>
                 <w:rFonts w:eastAsia="Times New Roman"/>
                 <w:bCs w:val="0"/>
@@ -14980,7 +15075,7 @@
           <w:p>
             <w:pPr>
               <w:spacing w:after="0" w:line="240" w:lineRule="auto"/>
-              <w:jc w:val="center"/>
+              <w:jc w:val="both"/>
               <w:rPr>
                 <w:rFonts w:eastAsia="Times New Roman"/>
                 <w:bCs w:val="0"/>
@@ -15014,7 +15109,7 @@
           <w:p>
             <w:pPr>
               <w:spacing w:after="0" w:line="240" w:lineRule="auto"/>
-              <w:jc w:val="center"/>
+              <w:jc w:val="both"/>
               <w:rPr>
                 <w:rFonts w:eastAsia="Times New Roman"/>
                 <w:bCs w:val="0"/>
@@ -15048,7 +15143,7 @@
           <w:p>
             <w:pPr>
               <w:spacing w:after="0" w:line="240" w:lineRule="auto"/>
-              <w:jc w:val="center"/>
+              <w:jc w:val="both"/>
               <w:rPr>
                 <w:rFonts w:eastAsia="Times New Roman"/>
                 <w:bCs w:val="0"/>
@@ -15082,7 +15177,7 @@
           <w:p>
             <w:pPr>
               <w:spacing w:after="0" w:line="240" w:lineRule="auto"/>
-              <w:jc w:val="center"/>
+              <w:jc w:val="both"/>
               <w:rPr>
                 <w:rFonts w:eastAsia="Times New Roman"/>
                 <w:bCs w:val="0"/>
@@ -15122,7 +15217,7 @@
           <w:p>
             <w:pPr>
               <w:spacing w:after="0" w:line="240" w:lineRule="auto"/>
-              <w:jc w:val="center"/>
+              <w:jc w:val="both"/>
               <w:rPr>
                 <w:rFonts w:eastAsia="Times New Roman"/>
                 <w:bCs w:val="0"/>
@@ -15157,7 +15252,7 @@
           <w:p>
             <w:pPr>
               <w:spacing w:after="0" w:line="240" w:lineRule="auto"/>
-              <w:jc w:val="center"/>
+              <w:jc w:val="both"/>
               <w:rPr>
                 <w:rFonts w:eastAsia="Times New Roman"/>
                 <w:bCs w:val="0"/>
@@ -15191,7 +15286,7 @@
           <w:p>
             <w:pPr>
               <w:spacing w:after="0" w:line="240" w:lineRule="auto"/>
-              <w:jc w:val="center"/>
+              <w:jc w:val="both"/>
               <w:rPr>
                 <w:rFonts w:eastAsia="Times New Roman"/>
                 <w:bCs w:val="0"/>
@@ -15225,7 +15320,7 @@
           <w:p>
             <w:pPr>
               <w:spacing w:after="0" w:line="240" w:lineRule="auto"/>
-              <w:jc w:val="center"/>
+              <w:jc w:val="both"/>
               <w:rPr>
                 <w:rFonts w:eastAsia="Times New Roman"/>
                 <w:bCs w:val="0"/>
@@ -15259,7 +15354,7 @@
           <w:p>
             <w:pPr>
               <w:spacing w:after="0" w:line="240" w:lineRule="auto"/>
-              <w:jc w:val="center"/>
+              <w:jc w:val="both"/>
               <w:rPr>
                 <w:rFonts w:eastAsia="Times New Roman"/>
                 <w:bCs w:val="0"/>
@@ -15293,7 +15388,7 @@
           <w:p>
             <w:pPr>
               <w:spacing w:after="0" w:line="240" w:lineRule="auto"/>
-              <w:jc w:val="center"/>
+              <w:jc w:val="both"/>
               <w:rPr>
                 <w:rFonts w:eastAsia="Times New Roman"/>
                 <w:bCs w:val="0"/>
@@ -15333,7 +15428,7 @@
           <w:p>
             <w:pPr>
               <w:spacing w:after="0" w:line="240" w:lineRule="auto"/>
-              <w:jc w:val="center"/>
+              <w:jc w:val="both"/>
               <w:rPr>
                 <w:rFonts w:eastAsia="Times New Roman"/>
                 <w:bCs w:val="0"/>
@@ -15368,7 +15463,7 @@
           <w:p>
             <w:pPr>
               <w:spacing w:after="0" w:line="240" w:lineRule="auto"/>
-              <w:jc w:val="center"/>
+              <w:jc w:val="both"/>
               <w:rPr>
                 <w:rFonts w:eastAsia="Times New Roman"/>
                 <w:bCs w:val="0"/>
@@ -15402,7 +15497,7 @@
           <w:p>
             <w:pPr>
               <w:spacing w:after="0" w:line="240" w:lineRule="auto"/>
-              <w:jc w:val="center"/>
+              <w:jc w:val="both"/>
               <w:rPr>
                 <w:rFonts w:eastAsia="Times New Roman"/>
                 <w:bCs w:val="0"/>
@@ -15436,7 +15531,7 @@
           <w:p>
             <w:pPr>
               <w:spacing w:after="0" w:line="240" w:lineRule="auto"/>
-              <w:jc w:val="center"/>
+              <w:jc w:val="both"/>
               <w:rPr>
                 <w:rFonts w:eastAsia="Times New Roman"/>
                 <w:bCs w:val="0"/>
@@ -15470,7 +15565,7 @@
           <w:p>
             <w:pPr>
               <w:spacing w:after="0" w:line="240" w:lineRule="auto"/>
-              <w:jc w:val="center"/>
+              <w:jc w:val="both"/>
               <w:rPr>
                 <w:rFonts w:eastAsia="Times New Roman"/>
                 <w:bCs w:val="0"/>
@@ -15504,7 +15599,7 @@
           <w:p>
             <w:pPr>
               <w:spacing w:after="0" w:line="240" w:lineRule="auto"/>
-              <w:jc w:val="center"/>
+              <w:jc w:val="both"/>
               <w:rPr>
                 <w:rFonts w:eastAsia="Times New Roman"/>
                 <w:bCs w:val="0"/>
@@ -15544,7 +15639,7 @@
           <w:p>
             <w:pPr>
               <w:spacing w:after="0" w:line="240" w:lineRule="auto"/>
-              <w:jc w:val="center"/>
+              <w:jc w:val="both"/>
               <w:rPr>
                 <w:rFonts w:eastAsia="Times New Roman"/>
                 <w:bCs w:val="0"/>
@@ -15579,7 +15674,7 @@
           <w:p>
             <w:pPr>
               <w:spacing w:after="0" w:line="240" w:lineRule="auto"/>
-              <w:jc w:val="center"/>
+              <w:jc w:val="both"/>
               <w:rPr>
                 <w:rFonts w:eastAsia="Times New Roman"/>
                 <w:bCs w:val="0"/>
@@ -15613,7 +15708,7 @@
           <w:p>
             <w:pPr>
               <w:spacing w:after="0" w:line="240" w:lineRule="auto"/>
-              <w:jc w:val="center"/>
+              <w:jc w:val="both"/>
               <w:rPr>
                 <w:rFonts w:eastAsia="Times New Roman"/>
                 <w:bCs w:val="0"/>
@@ -15647,7 +15742,7 @@
           <w:p>
             <w:pPr>
               <w:spacing w:after="0" w:line="240" w:lineRule="auto"/>
-              <w:jc w:val="center"/>
+              <w:jc w:val="both"/>
               <w:rPr>
                 <w:rFonts w:eastAsia="Times New Roman"/>
                 <w:bCs w:val="0"/>
@@ -15681,7 +15776,7 @@
           <w:p>
             <w:pPr>
               <w:spacing w:after="0" w:line="240" w:lineRule="auto"/>
-              <w:jc w:val="center"/>
+              <w:jc w:val="both"/>
               <w:rPr>
                 <w:rFonts w:eastAsia="Times New Roman"/>
                 <w:bCs w:val="0"/>
@@ -15715,7 +15810,7 @@
           <w:p>
             <w:pPr>
               <w:spacing w:after="0" w:line="240" w:lineRule="auto"/>
-              <w:jc w:val="center"/>
+              <w:jc w:val="both"/>
               <w:rPr>
                 <w:rFonts w:eastAsia="Times New Roman"/>
                 <w:bCs w:val="0"/>
@@ -15779,7 +15874,7 @@
           <w:p>
             <w:pPr>
               <w:spacing w:after="0" w:line="240" w:lineRule="auto"/>
-              <w:jc w:val="center"/>
+              <w:jc w:val="both"/>
               <w:rPr>
                 <w:rFonts w:eastAsia="Times New Roman"/>
                 <w:bCs w:val="0"/>
@@ -15814,7 +15909,7 @@
           <w:p>
             <w:pPr>
               <w:spacing w:after="0" w:line="240" w:lineRule="auto"/>
-              <w:jc w:val="center"/>
+              <w:jc w:val="both"/>
               <w:rPr>
                 <w:rFonts w:eastAsia="Times New Roman"/>
                 <w:bCs w:val="0"/>
@@ -15848,7 +15943,7 @@
           <w:p>
             <w:pPr>
               <w:spacing w:after="0" w:line="240" w:lineRule="auto"/>
-              <w:jc w:val="center"/>
+              <w:jc w:val="both"/>
               <w:rPr>
                 <w:rFonts w:eastAsia="Times New Roman"/>
                 <w:bCs w:val="0"/>
@@ -15882,7 +15977,7 @@
           <w:p>
             <w:pPr>
               <w:spacing w:after="0" w:line="240" w:lineRule="auto"/>
-              <w:jc w:val="center"/>
+              <w:jc w:val="both"/>
               <w:rPr>
                 <w:rFonts w:eastAsia="Times New Roman"/>
                 <w:bCs w:val="0"/>
@@ -15916,7 +16011,7 @@
           <w:p>
             <w:pPr>
               <w:spacing w:after="0" w:line="240" w:lineRule="auto"/>
-              <w:jc w:val="center"/>
+              <w:jc w:val="both"/>
               <w:rPr>
                 <w:rFonts w:eastAsia="Times New Roman"/>
                 <w:bCs w:val="0"/>
@@ -15950,7 +16045,7 @@
           <w:p>
             <w:pPr>
               <w:spacing w:after="0" w:line="240" w:lineRule="auto"/>
-              <w:jc w:val="center"/>
+              <w:jc w:val="both"/>
               <w:rPr>
                 <w:rFonts w:eastAsia="Times New Roman"/>
                 <w:bCs w:val="0"/>
@@ -15990,7 +16085,7 @@
           <w:p>
             <w:pPr>
               <w:spacing w:after="0" w:line="240" w:lineRule="auto"/>
-              <w:jc w:val="center"/>
+              <w:jc w:val="both"/>
               <w:rPr>
                 <w:rFonts w:eastAsia="Times New Roman"/>
                 <w:bCs w:val="0"/>
@@ -16025,7 +16120,7 @@
           <w:p>
             <w:pPr>
               <w:spacing w:after="0" w:line="240" w:lineRule="auto"/>
-              <w:jc w:val="center"/>
+              <w:jc w:val="both"/>
               <w:rPr>
                 <w:rFonts w:eastAsia="Times New Roman"/>
                 <w:bCs w:val="0"/>
@@ -16059,7 +16154,7 @@
           <w:p>
             <w:pPr>
               <w:spacing w:after="0" w:line="240" w:lineRule="auto"/>
-              <w:jc w:val="center"/>
+              <w:jc w:val="both"/>
               <w:rPr>
                 <w:rFonts w:eastAsia="Times New Roman"/>
                 <w:bCs w:val="0"/>
@@ -16093,7 +16188,7 @@
           <w:p>
             <w:pPr>
               <w:spacing w:after="0" w:line="240" w:lineRule="auto"/>
-              <w:jc w:val="center"/>
+              <w:jc w:val="both"/>
               <w:rPr>
                 <w:rFonts w:eastAsia="Times New Roman"/>
                 <w:bCs w:val="0"/>
@@ -16127,7 +16222,7 @@
           <w:p>
             <w:pPr>
               <w:spacing w:after="0" w:line="240" w:lineRule="auto"/>
-              <w:jc w:val="center"/>
+              <w:jc w:val="both"/>
               <w:rPr>
                 <w:rFonts w:eastAsia="Times New Roman"/>
                 <w:bCs w:val="0"/>
@@ -16161,7 +16256,7 @@
           <w:p>
             <w:pPr>
               <w:spacing w:after="0" w:line="240" w:lineRule="auto"/>
-              <w:jc w:val="center"/>
+              <w:jc w:val="both"/>
               <w:rPr>
                 <w:rFonts w:eastAsia="Times New Roman"/>
                 <w:bCs w:val="0"/>
@@ -16201,7 +16296,7 @@
           <w:p>
             <w:pPr>
               <w:spacing w:after="0" w:line="240" w:lineRule="auto"/>
-              <w:jc w:val="center"/>
+              <w:jc w:val="both"/>
               <w:rPr>
                 <w:rFonts w:eastAsia="Times New Roman"/>
                 <w:bCs w:val="0"/>
@@ -16236,7 +16331,7 @@
           <w:p>
             <w:pPr>
               <w:spacing w:after="0" w:line="240" w:lineRule="auto"/>
-              <w:jc w:val="center"/>
+              <w:jc w:val="both"/>
               <w:rPr>
                 <w:rFonts w:eastAsia="Times New Roman"/>
                 <w:bCs w:val="0"/>
@@ -16270,7 +16365,7 @@
           <w:p>
             <w:pPr>
               <w:spacing w:after="0" w:line="240" w:lineRule="auto"/>
-              <w:jc w:val="center"/>
+              <w:jc w:val="both"/>
               <w:rPr>
                 <w:rFonts w:eastAsia="Times New Roman"/>
                 <w:bCs w:val="0"/>
@@ -16304,7 +16399,7 @@
           <w:p>
             <w:pPr>
               <w:spacing w:after="0" w:line="240" w:lineRule="auto"/>
-              <w:jc w:val="center"/>
+              <w:jc w:val="both"/>
               <w:rPr>
                 <w:rFonts w:eastAsia="Times New Roman"/>
                 <w:bCs w:val="0"/>
@@ -16338,7 +16433,7 @@
           <w:p>
             <w:pPr>
               <w:spacing w:after="0" w:line="240" w:lineRule="auto"/>
-              <w:jc w:val="center"/>
+              <w:jc w:val="both"/>
               <w:rPr>
                 <w:rFonts w:eastAsia="Times New Roman"/>
                 <w:bCs w:val="0"/>
@@ -16372,7 +16467,7 @@
           <w:p>
             <w:pPr>
               <w:spacing w:after="0" w:line="240" w:lineRule="auto"/>
-              <w:jc w:val="center"/>
+              <w:jc w:val="both"/>
               <w:rPr>
                 <w:rFonts w:eastAsia="Times New Roman"/>
                 <w:bCs w:val="0"/>
@@ -16412,7 +16507,7 @@
           <w:p>
             <w:pPr>
               <w:spacing w:after="0" w:line="240" w:lineRule="auto"/>
-              <w:jc w:val="center"/>
+              <w:jc w:val="both"/>
               <w:rPr>
                 <w:rFonts w:eastAsia="Times New Roman"/>
                 <w:bCs w:val="0"/>
@@ -16447,7 +16542,7 @@
           <w:p>
             <w:pPr>
               <w:spacing w:after="0" w:line="240" w:lineRule="auto"/>
-              <w:jc w:val="center"/>
+              <w:jc w:val="both"/>
               <w:rPr>
                 <w:rFonts w:eastAsia="Times New Roman"/>
                 <w:bCs w:val="0"/>
@@ -16481,7 +16576,7 @@
           <w:p>
             <w:pPr>
               <w:spacing w:after="0" w:line="240" w:lineRule="auto"/>
-              <w:jc w:val="center"/>
+              <w:jc w:val="both"/>
               <w:rPr>
                 <w:rFonts w:eastAsia="Times New Roman"/>
                 <w:bCs w:val="0"/>
@@ -16515,7 +16610,7 @@
           <w:p>
             <w:pPr>
               <w:spacing w:after="0" w:line="240" w:lineRule="auto"/>
-              <w:jc w:val="center"/>
+              <w:jc w:val="both"/>
               <w:rPr>
                 <w:rFonts w:eastAsia="Times New Roman"/>
                 <w:bCs w:val="0"/>
@@ -16549,7 +16644,7 @@
           <w:p>
             <w:pPr>
               <w:spacing w:after="0" w:line="240" w:lineRule="auto"/>
-              <w:jc w:val="center"/>
+              <w:jc w:val="both"/>
               <w:rPr>
                 <w:rFonts w:eastAsia="Times New Roman"/>
                 <w:bCs w:val="0"/>
@@ -16583,7 +16678,7 @@
           <w:p>
             <w:pPr>
               <w:spacing w:after="0" w:line="240" w:lineRule="auto"/>
-              <w:jc w:val="center"/>
+              <w:jc w:val="both"/>
               <w:rPr>
                 <w:rFonts w:eastAsia="Times New Roman"/>
                 <w:bCs w:val="0"/>
@@ -16612,6 +16707,7 @@
     </w:tbl>
     <w:p>
       <w:pPr>
+        <w:jc w:val="both"/>
         <w:rPr>
           <w:rFonts w:eastAsiaTheme="minorEastAsia"/>
         </w:rPr>
@@ -16674,7 +16770,7 @@
     </w:p>
     <w:p>
       <w:pPr>
-        <w:jc w:val="center"/>
+        <w:jc w:val="both"/>
         <w:rPr>
           <w:rFonts w:eastAsiaTheme="minorEastAsia"/>
         </w:rPr>
@@ -16682,6 +16778,7 @@
     </w:p>
     <w:p>
       <w:pPr>
+        <w:jc w:val="both"/>
         <w:rPr>
           <w:rFonts w:eastAsiaTheme="minorEastAsia"/>
         </w:rPr>
@@ -16689,6 +16786,7 @@
     </w:p>
     <w:p>
       <w:pPr>
+        <w:jc w:val="both"/>
         <w:rPr>
           <w:rFonts w:eastAsiaTheme="minorEastAsia"/>
         </w:rPr>
@@ -16696,6 +16794,7 @@
     </w:p>
     <w:p>
       <w:pPr>
+        <w:jc w:val="both"/>
         <w:rPr>
           <w:rFonts w:eastAsiaTheme="minorEastAsia"/>
         </w:rPr>
@@ -16703,6 +16802,7 @@
     </w:p>
     <w:p>
       <w:pPr>
+        <w:jc w:val="both"/>
         <w:rPr>
           <w:rFonts w:eastAsiaTheme="minorEastAsia"/>
         </w:rPr>
@@ -16710,6 +16810,7 @@
     </w:p>
     <w:p>
       <w:pPr>
+        <w:jc w:val="both"/>
         <w:rPr>
           <w:rFonts w:eastAsiaTheme="minorEastAsia"/>
         </w:rPr>
@@ -16810,6 +16911,7 @@
     <w:p>
       <w:pPr>
         <w:spacing w:after="0" w:line="240" w:lineRule="auto"/>
+        <w:jc w:val="both"/>
         <w:rPr>
           <w:rFonts w:eastAsia="Times New Roman"/>
           <w:bCs w:val="0"/>
@@ -16856,22 +16958,11 @@
         </w:rPr>
         <w:t>78</w:t>
       </w:r>
-      <w:r>
-        <w:rPr>
-          <w:rFonts w:eastAsia="Times New Roman"/>
-          <w:bCs w:val="0"/>
-          <w:iCs w:val="0"/>
-          <w:kern w:val="0"/>
-          <w:szCs w:val="24"/>
-          <w:lang w:eastAsia="en-IN"/>
-          <w14:ligatures w14:val="none"/>
-        </w:rPr>
-        <w:t xml:space="preserve"> </w:t>
-      </w:r>
     </w:p>
     <w:p>
       <w:pPr>
         <w:spacing w:after="0" w:line="240" w:lineRule="auto"/>
+        <w:jc w:val="both"/>
         <w:rPr>
           <w:rFonts w:eastAsia="Times New Roman"/>
           <w:bCs w:val="0"/>
@@ -16918,21 +17009,10 @@
         </w:rPr>
         <w:t>0.1</w:t>
       </w:r>
-      <w:r>
-        <w:rPr>
-          <w:rFonts w:eastAsia="Times New Roman"/>
-          <w:bCs w:val="0"/>
-          <w:iCs w:val="0"/>
-          <w:kern w:val="0"/>
-          <w:szCs w:val="24"/>
-          <w:lang w:eastAsia="en-IN"/>
-          <w14:ligatures w14:val="none"/>
-        </w:rPr>
-        <w:t xml:space="preserve"> </w:t>
-      </w:r>
     </w:p>
     <w:p>
       <w:pPr>
+        <w:jc w:val="both"/>
         <w:rPr>
           <w:rFonts w:eastAsia="Times New Roman"/>
           <w:b/>
@@ -17116,6 +17196,7 @@
     </w:p>
     <w:p>
       <w:pPr>
+        <w:jc w:val="both"/>
         <w:rPr>
           <w:rFonts w:eastAsiaTheme="minorEastAsia"/>
           <w:b/>
@@ -17163,6 +17244,7 @@
     </w:p>
     <w:p>
       <w:pPr>
+        <w:jc w:val="both"/>
         <w:rPr>
           <w:rFonts w:eastAsiaTheme="minorEastAsia"/>
         </w:rPr>
@@ -17203,25 +17285,88 @@
       </m:oMathPara>
     </w:p>
     <w:p>
+      <w:pPr>
+        <w:jc w:val="both"/>
+      </w:pPr>
       <w:r>
         <w:br/>
       </w:r>
     </w:p>
-    <w:p/>
-    <w:p/>
-    <w:p/>
-    <w:p/>
-    <w:p/>
-    <w:p/>
-    <w:p/>
-    <w:p/>
-    <w:p/>
-    <w:p/>
-    <w:p/>
-    <w:p/>
-    <w:p/>
-    <w:p/>
-    <w:p/>
+    <w:p>
+      <w:pPr>
+        <w:jc w:val="both"/>
+      </w:pPr>
+    </w:p>
+    <w:p>
+      <w:pPr>
+        <w:jc w:val="both"/>
+      </w:pPr>
+    </w:p>
+    <w:p>
+      <w:pPr>
+        <w:jc w:val="both"/>
+      </w:pPr>
+    </w:p>
+    <w:p>
+      <w:pPr>
+        <w:jc w:val="both"/>
+      </w:pPr>
+    </w:p>
+    <w:p>
+      <w:pPr>
+        <w:jc w:val="both"/>
+      </w:pPr>
+    </w:p>
+    <w:p>
+      <w:pPr>
+        <w:jc w:val="both"/>
+      </w:pPr>
+    </w:p>
+    <w:p>
+      <w:pPr>
+        <w:jc w:val="both"/>
+      </w:pPr>
+    </w:p>
+    <w:p>
+      <w:pPr>
+        <w:jc w:val="both"/>
+      </w:pPr>
+    </w:p>
+    <w:p>
+      <w:pPr>
+        <w:jc w:val="both"/>
+      </w:pPr>
+    </w:p>
+    <w:p>
+      <w:pPr>
+        <w:jc w:val="both"/>
+      </w:pPr>
+    </w:p>
+    <w:p>
+      <w:pPr>
+        <w:jc w:val="both"/>
+      </w:pPr>
+    </w:p>
+    <w:p>
+      <w:pPr>
+        <w:jc w:val="both"/>
+      </w:pPr>
+    </w:p>
+    <w:p>
+      <w:pPr>
+        <w:jc w:val="both"/>
+      </w:pPr>
+    </w:p>
+    <w:p>
+      <w:pPr>
+        <w:jc w:val="both"/>
+      </w:pPr>
+    </w:p>
+    <w:p>
+      <w:pPr>
+        <w:jc w:val="both"/>
+      </w:pPr>
+    </w:p>
     <w:p>
       <w:r>
         <w:lastRenderedPageBreak/>
@@ -17266,7 +17411,7 @@
     </w:p>
     <w:p>
       <w:pPr>
-        <w:jc w:val="center"/>
+        <w:jc w:val="both"/>
         <w:rPr>
           <w:b/>
           <w:bCs w:val="0"/>
@@ -19387,7 +19532,11 @@
         </w:tc>
       </w:tr>
     </w:tbl>
-    <w:p/>
+    <w:p>
+      <w:pPr>
+        <w:jc w:val="both"/>
+      </w:pPr>
+    </w:p>
     <w:p>
       <w:pPr>
         <w:rPr>
@@ -21755,6 +21904,9 @@
       </w:tr>
     </w:tbl>
     <w:p>
+      <w:pPr>
+        <w:jc w:val="both"/>
+      </w:pPr>
       <w:r>
         <w:rPr>
           <w:b/>
@@ -21763,12 +21915,35 @@
         <w:br/>
       </w:r>
     </w:p>
-    <w:p/>
-    <w:p/>
-    <w:p/>
-    <w:p/>
-    <w:p/>
     <w:p>
+      <w:pPr>
+        <w:jc w:val="both"/>
+      </w:pPr>
+    </w:p>
+    <w:p>
+      <w:pPr>
+        <w:jc w:val="both"/>
+      </w:pPr>
+    </w:p>
+    <w:p>
+      <w:pPr>
+        <w:jc w:val="both"/>
+      </w:pPr>
+    </w:p>
+    <w:p>
+      <w:pPr>
+        <w:jc w:val="both"/>
+      </w:pPr>
+    </w:p>
+    <w:p>
+      <w:pPr>
+        <w:jc w:val="both"/>
+      </w:pPr>
+    </w:p>
+    <w:p>
+      <w:pPr>
+        <w:jc w:val="both"/>
+      </w:pPr>
       <w:r>
         <w:lastRenderedPageBreak/>
         <w:t>Sort By Area</w:t>
@@ -22595,8 +22770,15 @@
         </w:tc>
       </w:tr>
     </w:tbl>
-    <w:p/>
     <w:p>
+      <w:pPr>
+        <w:jc w:val="both"/>
+      </w:pPr>
+    </w:p>
+    <w:p>
+      <w:pPr>
+        <w:jc w:val="both"/>
+      </w:pPr>
       <w:r>
         <w:t>Possible Split Points</w:t>
       </w:r>
@@ -23414,7 +23596,7 @@
           <w:p>
             <w:pPr>
               <w:spacing w:after="0" w:line="240" w:lineRule="auto"/>
-              <w:jc w:val="center"/>
+              <w:jc w:val="both"/>
               <w:rPr>
                 <w:rFonts w:eastAsia="Times New Roman"/>
                 <w:b/>
@@ -23448,7 +23630,7 @@
           <w:p>
             <w:pPr>
               <w:spacing w:after="0" w:line="240" w:lineRule="auto"/>
-              <w:jc w:val="right"/>
+              <w:jc w:val="both"/>
               <w:rPr>
                 <w:rFonts w:eastAsia="Times New Roman"/>
                 <w:b/>
@@ -23487,6 +23669,7 @@
           <w:p>
             <w:pPr>
               <w:spacing w:after="0" w:line="240" w:lineRule="auto"/>
+              <w:jc w:val="both"/>
               <w:rPr>
                 <w:rFonts w:eastAsia="Times New Roman"/>
                 <w:bCs w:val="0"/>
@@ -23520,7 +23703,7 @@
           <w:p>
             <w:pPr>
               <w:spacing w:after="0" w:line="240" w:lineRule="auto"/>
-              <w:jc w:val="right"/>
+              <w:jc w:val="both"/>
               <w:rPr>
                 <w:rFonts w:eastAsia="Times New Roman"/>
                 <w:bCs w:val="0"/>
@@ -23549,6 +23732,7 @@
     </w:tbl>
     <w:p>
       <w:pPr>
+        <w:jc w:val="both"/>
         <w:rPr>
           <w:rFonts w:ascii="Cambria Math" w:hAnsi="Cambria Math"/>
           <w:oMath/>
@@ -23571,6 +23755,7 @@
     </w:p>
     <w:p>
       <w:pPr>
+        <w:jc w:val="both"/>
         <w:rPr>
           <w:rFonts w:eastAsiaTheme="minorEastAsia"/>
           <w:b/>
@@ -23685,6 +23870,7 @@
     </w:p>
     <w:p>
       <w:pPr>
+        <w:jc w:val="both"/>
         <w:rPr>
           <w:rFonts w:ascii="Cambria Math" w:eastAsiaTheme="minorEastAsia" w:hAnsi="Cambria Math"/>
           <w:oMath/>
@@ -23700,6 +23886,7 @@
     </w:p>
     <w:p>
       <w:pPr>
+        <w:jc w:val="both"/>
         <w:rPr>
           <w:rFonts w:eastAsiaTheme="minorEastAsia"/>
           <w:b/>
@@ -23824,7 +24011,7 @@
           <w:p>
             <w:pPr>
               <w:spacing w:after="0" w:line="240" w:lineRule="auto"/>
-              <w:jc w:val="right"/>
+              <w:jc w:val="both"/>
               <w:rPr>
                 <w:rFonts w:eastAsia="Times New Roman"/>
                 <w:b/>
@@ -23858,7 +24045,7 @@
           <w:p>
             <w:pPr>
               <w:spacing w:after="0" w:line="240" w:lineRule="auto"/>
-              <w:jc w:val="right"/>
+              <w:jc w:val="both"/>
               <w:rPr>
                 <w:rFonts w:eastAsia="Times New Roman"/>
                 <w:b/>
@@ -23892,7 +24079,7 @@
           <w:p>
             <w:pPr>
               <w:spacing w:after="0" w:line="240" w:lineRule="auto"/>
-              <w:jc w:val="center"/>
+              <w:jc w:val="both"/>
               <w:rPr>
                 <w:rFonts w:eastAsia="Times New Roman"/>
                 <w:b/>
@@ -23926,7 +24113,7 @@
           <w:p>
             <w:pPr>
               <w:spacing w:after="0" w:line="240" w:lineRule="auto"/>
-              <w:jc w:val="right"/>
+              <w:jc w:val="both"/>
               <w:rPr>
                 <w:rFonts w:eastAsia="Times New Roman"/>
                 <w:b/>
@@ -23966,7 +24153,7 @@
           <w:p>
             <w:pPr>
               <w:spacing w:after="0" w:line="240" w:lineRule="auto"/>
-              <w:jc w:val="right"/>
+              <w:jc w:val="both"/>
               <w:rPr>
                 <w:rFonts w:eastAsia="Times New Roman"/>
                 <w:bCs w:val="0"/>
@@ -24000,7 +24187,7 @@
           <w:p>
             <w:pPr>
               <w:spacing w:after="0" w:line="240" w:lineRule="auto"/>
-              <w:jc w:val="right"/>
+              <w:jc w:val="both"/>
               <w:rPr>
                 <w:rFonts w:eastAsia="Times New Roman"/>
                 <w:bCs w:val="0"/>
@@ -24034,6 +24221,7 @@
           <w:p>
             <w:pPr>
               <w:spacing w:after="0" w:line="240" w:lineRule="auto"/>
+              <w:jc w:val="both"/>
               <w:rPr>
                 <w:rFonts w:eastAsia="Times New Roman"/>
                 <w:bCs w:val="0"/>
@@ -24067,7 +24255,7 @@
           <w:p>
             <w:pPr>
               <w:spacing w:after="0" w:line="240" w:lineRule="auto"/>
-              <w:jc w:val="right"/>
+              <w:jc w:val="both"/>
               <w:rPr>
                 <w:rFonts w:eastAsia="Times New Roman"/>
                 <w:bCs w:val="0"/>
@@ -24096,6 +24284,7 @@
     </w:tbl>
     <w:p>
       <w:pPr>
+        <w:jc w:val="both"/>
         <w:rPr>
           <w:rFonts w:eastAsiaTheme="minorEastAsia"/>
           <w:b/>
@@ -24105,6 +24294,7 @@
     </w:p>
     <w:p>
       <w:pPr>
+        <w:jc w:val="both"/>
         <w:rPr>
           <w:rFonts w:eastAsiaTheme="minorEastAsia"/>
           <w:b/>
@@ -24882,6 +25072,7 @@
     </w:tbl>
     <w:p>
       <w:pPr>
+        <w:jc w:val="both"/>
         <w:rPr>
           <w:rFonts w:eastAsiaTheme="minorEastAsia"/>
           <w:b/>
@@ -25001,6 +25192,7 @@
     </w:p>
     <w:p>
       <w:pPr>
+        <w:jc w:val="both"/>
         <w:rPr>
           <w:rFonts w:eastAsiaTheme="minorEastAsia"/>
         </w:rPr>
@@ -25176,6 +25368,7 @@
     </w:p>
     <w:p>
       <w:pPr>
+        <w:jc w:val="both"/>
         <w:rPr>
           <w:rFonts w:eastAsiaTheme="minorEastAsia"/>
         </w:rPr>
@@ -25215,7 +25408,7 @@
           <w:p>
             <w:pPr>
               <w:spacing w:after="0" w:line="240" w:lineRule="auto"/>
-              <w:jc w:val="right"/>
+              <w:jc w:val="both"/>
               <w:rPr>
                 <w:rFonts w:eastAsia="Times New Roman"/>
                 <w:b/>
@@ -25249,7 +25442,7 @@
           <w:p>
             <w:pPr>
               <w:spacing w:after="0" w:line="240" w:lineRule="auto"/>
-              <w:jc w:val="right"/>
+              <w:jc w:val="both"/>
               <w:rPr>
                 <w:rFonts w:eastAsia="Times New Roman"/>
                 <w:b/>
@@ -25283,7 +25476,7 @@
           <w:p>
             <w:pPr>
               <w:spacing w:after="0" w:line="240" w:lineRule="auto"/>
-              <w:jc w:val="center"/>
+              <w:jc w:val="both"/>
               <w:rPr>
                 <w:rFonts w:eastAsia="Times New Roman"/>
                 <w:b/>
@@ -25317,7 +25510,7 @@
           <w:p>
             <w:pPr>
               <w:spacing w:after="0" w:line="240" w:lineRule="auto"/>
-              <w:jc w:val="right"/>
+              <w:jc w:val="both"/>
               <w:rPr>
                 <w:rFonts w:eastAsia="Times New Roman"/>
                 <w:b/>
@@ -25357,7 +25550,7 @@
           <w:p>
             <w:pPr>
               <w:spacing w:after="0" w:line="240" w:lineRule="auto"/>
-              <w:jc w:val="right"/>
+              <w:jc w:val="both"/>
               <w:rPr>
                 <w:rFonts w:eastAsia="Times New Roman"/>
                 <w:bCs w:val="0"/>
@@ -25391,7 +25584,7 @@
           <w:p>
             <w:pPr>
               <w:spacing w:after="0" w:line="240" w:lineRule="auto"/>
-              <w:jc w:val="right"/>
+              <w:jc w:val="both"/>
               <w:rPr>
                 <w:rFonts w:eastAsia="Times New Roman"/>
                 <w:bCs w:val="0"/>
@@ -25425,6 +25618,7 @@
           <w:p>
             <w:pPr>
               <w:spacing w:after="0" w:line="240" w:lineRule="auto"/>
+              <w:jc w:val="both"/>
               <w:rPr>
                 <w:rFonts w:eastAsia="Times New Roman"/>
                 <w:bCs w:val="0"/>
@@ -25458,7 +25652,7 @@
           <w:p>
             <w:pPr>
               <w:spacing w:after="0" w:line="240" w:lineRule="auto"/>
-              <w:jc w:val="right"/>
+              <w:jc w:val="both"/>
               <w:rPr>
                 <w:rFonts w:eastAsia="Times New Roman"/>
                 <w:bCs w:val="0"/>
@@ -25498,7 +25692,7 @@
           <w:p>
             <w:pPr>
               <w:spacing w:after="0" w:line="240" w:lineRule="auto"/>
-              <w:jc w:val="right"/>
+              <w:jc w:val="both"/>
               <w:rPr>
                 <w:rFonts w:eastAsia="Times New Roman"/>
                 <w:bCs w:val="0"/>
@@ -25532,7 +25726,7 @@
           <w:p>
             <w:pPr>
               <w:spacing w:after="0" w:line="240" w:lineRule="auto"/>
-              <w:jc w:val="right"/>
+              <w:jc w:val="both"/>
               <w:rPr>
                 <w:rFonts w:eastAsia="Times New Roman"/>
                 <w:bCs w:val="0"/>
@@ -25566,6 +25760,7 @@
           <w:p>
             <w:pPr>
               <w:spacing w:after="0" w:line="240" w:lineRule="auto"/>
+              <w:jc w:val="both"/>
               <w:rPr>
                 <w:rFonts w:eastAsia="Times New Roman"/>
                 <w:bCs w:val="0"/>
@@ -25599,7 +25794,7 @@
           <w:p>
             <w:pPr>
               <w:spacing w:after="0" w:line="240" w:lineRule="auto"/>
-              <w:jc w:val="right"/>
+              <w:jc w:val="both"/>
               <w:rPr>
                 <w:rFonts w:eastAsia="Times New Roman"/>
                 <w:bCs w:val="0"/>
@@ -25639,7 +25834,7 @@
           <w:p>
             <w:pPr>
               <w:spacing w:after="0" w:line="240" w:lineRule="auto"/>
-              <w:jc w:val="right"/>
+              <w:jc w:val="both"/>
               <w:rPr>
                 <w:rFonts w:eastAsia="Times New Roman"/>
                 <w:bCs w:val="0"/>
@@ -25673,7 +25868,7 @@
           <w:p>
             <w:pPr>
               <w:spacing w:after="0" w:line="240" w:lineRule="auto"/>
-              <w:jc w:val="right"/>
+              <w:jc w:val="both"/>
               <w:rPr>
                 <w:rFonts w:eastAsia="Times New Roman"/>
                 <w:bCs w:val="0"/>
@@ -25707,6 +25902,7 @@
           <w:p>
             <w:pPr>
               <w:spacing w:after="0" w:line="240" w:lineRule="auto"/>
+              <w:jc w:val="both"/>
               <w:rPr>
                 <w:rFonts w:eastAsia="Times New Roman"/>
                 <w:bCs w:val="0"/>
@@ -25740,7 +25936,7 @@
           <w:p>
             <w:pPr>
               <w:spacing w:after="0" w:line="240" w:lineRule="auto"/>
-              <w:jc w:val="right"/>
+              <w:jc w:val="both"/>
               <w:rPr>
                 <w:rFonts w:eastAsia="Times New Roman"/>
                 <w:bCs w:val="0"/>
@@ -25780,7 +25976,7 @@
           <w:p>
             <w:pPr>
               <w:spacing w:after="0" w:line="240" w:lineRule="auto"/>
-              <w:jc w:val="right"/>
+              <w:jc w:val="both"/>
               <w:rPr>
                 <w:rFonts w:eastAsia="Times New Roman"/>
                 <w:bCs w:val="0"/>
@@ -25814,7 +26010,7 @@
           <w:p>
             <w:pPr>
               <w:spacing w:after="0" w:line="240" w:lineRule="auto"/>
-              <w:jc w:val="right"/>
+              <w:jc w:val="both"/>
               <w:rPr>
                 <w:rFonts w:eastAsia="Times New Roman"/>
                 <w:bCs w:val="0"/>
@@ -25848,6 +26044,7 @@
           <w:p>
             <w:pPr>
               <w:spacing w:after="0" w:line="240" w:lineRule="auto"/>
+              <w:jc w:val="both"/>
               <w:rPr>
                 <w:rFonts w:eastAsia="Times New Roman"/>
                 <w:bCs w:val="0"/>
@@ -25881,7 +26078,7 @@
           <w:p>
             <w:pPr>
               <w:spacing w:after="0" w:line="240" w:lineRule="auto"/>
-              <w:jc w:val="right"/>
+              <w:jc w:val="both"/>
               <w:rPr>
                 <w:rFonts w:eastAsia="Times New Roman"/>
                 <w:bCs w:val="0"/>
@@ -25921,7 +26118,7 @@
           <w:p>
             <w:pPr>
               <w:spacing w:after="0" w:line="240" w:lineRule="auto"/>
-              <w:jc w:val="right"/>
+              <w:jc w:val="both"/>
               <w:rPr>
                 <w:rFonts w:eastAsia="Times New Roman"/>
                 <w:bCs w:val="0"/>
@@ -25955,7 +26152,7 @@
           <w:p>
             <w:pPr>
               <w:spacing w:after="0" w:line="240" w:lineRule="auto"/>
-              <w:jc w:val="right"/>
+              <w:jc w:val="both"/>
               <w:rPr>
                 <w:rFonts w:eastAsia="Times New Roman"/>
                 <w:bCs w:val="0"/>
@@ -25989,6 +26186,7 @@
           <w:p>
             <w:pPr>
               <w:spacing w:after="0" w:line="240" w:lineRule="auto"/>
+              <w:jc w:val="both"/>
               <w:rPr>
                 <w:rFonts w:eastAsia="Times New Roman"/>
                 <w:bCs w:val="0"/>
@@ -26022,7 +26220,7 @@
           <w:p>
             <w:pPr>
               <w:spacing w:after="0" w:line="240" w:lineRule="auto"/>
-              <w:jc w:val="right"/>
+              <w:jc w:val="both"/>
               <w:rPr>
                 <w:rFonts w:eastAsia="Times New Roman"/>
                 <w:bCs w:val="0"/>
@@ -26062,7 +26260,7 @@
           <w:p>
             <w:pPr>
               <w:spacing w:after="0" w:line="240" w:lineRule="auto"/>
-              <w:jc w:val="right"/>
+              <w:jc w:val="both"/>
               <w:rPr>
                 <w:rFonts w:eastAsia="Times New Roman"/>
                 <w:bCs w:val="0"/>
@@ -26096,7 +26294,7 @@
           <w:p>
             <w:pPr>
               <w:spacing w:after="0" w:line="240" w:lineRule="auto"/>
-              <w:jc w:val="right"/>
+              <w:jc w:val="both"/>
               <w:rPr>
                 <w:rFonts w:eastAsia="Times New Roman"/>
                 <w:bCs w:val="0"/>
@@ -26130,6 +26328,7 @@
           <w:p>
             <w:pPr>
               <w:spacing w:after="0" w:line="240" w:lineRule="auto"/>
+              <w:jc w:val="both"/>
               <w:rPr>
                 <w:rFonts w:eastAsia="Times New Roman"/>
                 <w:bCs w:val="0"/>
@@ -26163,7 +26362,7 @@
           <w:p>
             <w:pPr>
               <w:spacing w:after="0" w:line="240" w:lineRule="auto"/>
-              <w:jc w:val="right"/>
+              <w:jc w:val="both"/>
               <w:rPr>
                 <w:rFonts w:eastAsia="Times New Roman"/>
                 <w:bCs w:val="0"/>
@@ -26203,7 +26402,7 @@
           <w:p>
             <w:pPr>
               <w:spacing w:after="0" w:line="240" w:lineRule="auto"/>
-              <w:jc w:val="right"/>
+              <w:jc w:val="both"/>
               <w:rPr>
                 <w:rFonts w:eastAsia="Times New Roman"/>
                 <w:bCs w:val="0"/>
@@ -26237,7 +26436,7 @@
           <w:p>
             <w:pPr>
               <w:spacing w:after="0" w:line="240" w:lineRule="auto"/>
-              <w:jc w:val="right"/>
+              <w:jc w:val="both"/>
               <w:rPr>
                 <w:rFonts w:eastAsia="Times New Roman"/>
                 <w:bCs w:val="0"/>
@@ -26271,6 +26470,7 @@
           <w:p>
             <w:pPr>
               <w:spacing w:after="0" w:line="240" w:lineRule="auto"/>
+              <w:jc w:val="both"/>
               <w:rPr>
                 <w:rFonts w:eastAsia="Times New Roman"/>
                 <w:bCs w:val="0"/>
@@ -26304,7 +26504,7 @@
           <w:p>
             <w:pPr>
               <w:spacing w:after="0" w:line="240" w:lineRule="auto"/>
-              <w:jc w:val="right"/>
+              <w:jc w:val="both"/>
               <w:rPr>
                 <w:rFonts w:eastAsia="Times New Roman"/>
                 <w:bCs w:val="0"/>
@@ -26344,7 +26544,7 @@
           <w:p>
             <w:pPr>
               <w:spacing w:after="0" w:line="240" w:lineRule="auto"/>
-              <w:jc w:val="right"/>
+              <w:jc w:val="both"/>
               <w:rPr>
                 <w:rFonts w:eastAsia="Times New Roman"/>
                 <w:bCs w:val="0"/>
@@ -26378,7 +26578,7 @@
           <w:p>
             <w:pPr>
               <w:spacing w:after="0" w:line="240" w:lineRule="auto"/>
-              <w:jc w:val="right"/>
+              <w:jc w:val="both"/>
               <w:rPr>
                 <w:rFonts w:eastAsia="Times New Roman"/>
                 <w:bCs w:val="0"/>
@@ -26412,6 +26612,7 @@
           <w:p>
             <w:pPr>
               <w:spacing w:after="0" w:line="240" w:lineRule="auto"/>
+              <w:jc w:val="both"/>
               <w:rPr>
                 <w:rFonts w:eastAsia="Times New Roman"/>
                 <w:bCs w:val="0"/>
@@ -26445,7 +26646,7 @@
           <w:p>
             <w:pPr>
               <w:spacing w:after="0" w:line="240" w:lineRule="auto"/>
-              <w:jc w:val="right"/>
+              <w:jc w:val="both"/>
               <w:rPr>
                 <w:rFonts w:eastAsia="Times New Roman"/>
                 <w:bCs w:val="0"/>
@@ -26485,7 +26686,7 @@
           <w:p>
             <w:pPr>
               <w:spacing w:after="0" w:line="240" w:lineRule="auto"/>
-              <w:jc w:val="right"/>
+              <w:jc w:val="both"/>
               <w:rPr>
                 <w:rFonts w:eastAsia="Times New Roman"/>
                 <w:bCs w:val="0"/>
@@ -26519,7 +26720,7 @@
           <w:p>
             <w:pPr>
               <w:spacing w:after="0" w:line="240" w:lineRule="auto"/>
-              <w:jc w:val="right"/>
+              <w:jc w:val="both"/>
               <w:rPr>
                 <w:rFonts w:eastAsia="Times New Roman"/>
                 <w:bCs w:val="0"/>
@@ -26553,6 +26754,7 @@
           <w:p>
             <w:pPr>
               <w:spacing w:after="0" w:line="240" w:lineRule="auto"/>
+              <w:jc w:val="both"/>
               <w:rPr>
                 <w:rFonts w:eastAsia="Times New Roman"/>
                 <w:bCs w:val="0"/>
@@ -26586,7 +26788,7 @@
           <w:p>
             <w:pPr>
               <w:spacing w:after="0" w:line="240" w:lineRule="auto"/>
-              <w:jc w:val="right"/>
+              <w:jc w:val="both"/>
               <w:rPr>
                 <w:rFonts w:eastAsia="Times New Roman"/>
                 <w:bCs w:val="0"/>
@@ -26615,6 +26817,7 @@
     </w:tbl>
     <w:p>
       <w:pPr>
+        <w:jc w:val="both"/>
         <w:rPr>
           <w:rFonts w:eastAsiaTheme="minorEastAsia"/>
         </w:rPr>
@@ -26662,7 +26865,11 @@
         </m:oMath>
       </m:oMathPara>
     </w:p>
-    <w:p/>
+    <w:p>
+      <w:pPr>
+        <w:jc w:val="both"/>
+      </w:pPr>
+    </w:p>
     <w:p>
       <w:pPr>
         <w:rPr>
@@ -26768,6 +26975,7 @@
     </w:p>
     <w:p>
       <w:pPr>
+        <w:jc w:val="both"/>
         <w:rPr>
           <w:b/>
           <w:bCs w:val="0"/>
@@ -28924,6 +29132,7 @@
     </w:tbl>
     <w:p>
       <w:pPr>
+        <w:jc w:val="both"/>
         <w:rPr>
           <w:rFonts w:eastAsiaTheme="minorEastAsia"/>
         </w:rPr>
@@ -28931,6 +29140,7 @@
     </w:p>
     <w:p>
       <w:pPr>
+        <w:jc w:val="both"/>
         <w:rPr>
           <w:rFonts w:eastAsiaTheme="minorEastAsia"/>
         </w:rPr>
@@ -28999,11 +29209,17 @@
     </w:p>
     <w:p>
       <w:pPr>
+        <w:jc w:val="both"/>
         <w:rPr>
           <w:rFonts w:eastAsiaTheme="minorEastAsia"/>
         </w:rPr>
       </w:pPr>
     </w:p>
+    <w:p/>
+    <w:p/>
+    <w:p/>
+    <w:p/>
+    <w:p/>
     <w:p>
       <w:pPr>
         <w:rPr>
@@ -29011,6 +29227,7 @@
         </w:rPr>
       </w:pPr>
       <w:r>
+        <w:lastRenderedPageBreak/>
         <w:t>Update the Predictions Using the First Decision Tree</w:t>
       </w:r>
       <w:r>
@@ -29097,21 +29314,8 @@
     </w:p>
     <w:p>
       <w:pPr>
-        <w:rPr>
-          <w:rFonts w:eastAsiaTheme="minorEastAsia"/>
-        </w:rPr>
-      </w:pPr>
-    </w:p>
-    <w:p>
-      <w:pPr>
-        <w:rPr>
-          <w:rFonts w:eastAsiaTheme="minorEastAsia"/>
-        </w:rPr>
-      </w:pPr>
-    </w:p>
-    <w:p>
-      <w:pPr>
         <w:spacing w:after="0" w:line="240" w:lineRule="auto"/>
+        <w:jc w:val="both"/>
         <w:rPr>
           <w:rFonts w:eastAsia="Times New Roman"/>
           <w:bCs w:val="0"/>
@@ -29132,7 +29336,6 @@
           <w:lang w:eastAsia="en-IN"/>
           <w14:ligatures w14:val="none"/>
         </w:rPr>
-        <w:lastRenderedPageBreak/>
         <w:t></w:t>
       </w:r>
       <w:r>
@@ -29183,22 +29386,11 @@
         </w:rPr>
         <w:t>79.6</w:t>
       </w:r>
-      <w:r>
-        <w:rPr>
-          <w:rFonts w:eastAsia="Times New Roman"/>
-          <w:bCs w:val="0"/>
-          <w:iCs w:val="0"/>
-          <w:kern w:val="0"/>
-          <w:szCs w:val="24"/>
-          <w:lang w:eastAsia="en-IN"/>
-          <w14:ligatures w14:val="none"/>
-        </w:rPr>
-        <w:t xml:space="preserve"> </w:t>
-      </w:r>
     </w:p>
     <w:p>
       <w:pPr>
         <w:spacing w:after="0" w:line="240" w:lineRule="auto"/>
+        <w:jc w:val="both"/>
         <w:rPr>
           <w:rFonts w:eastAsia="Times New Roman"/>
           <w:bCs w:val="0"/>
@@ -29245,21 +29437,10 @@
         </w:rPr>
         <w:t>0.1</w:t>
       </w:r>
-      <w:r>
-        <w:rPr>
-          <w:rFonts w:eastAsia="Times New Roman"/>
-          <w:bCs w:val="0"/>
-          <w:iCs w:val="0"/>
-          <w:kern w:val="0"/>
-          <w:szCs w:val="24"/>
-          <w:lang w:eastAsia="en-IN"/>
-          <w14:ligatures w14:val="none"/>
-        </w:rPr>
-        <w:t xml:space="preserve"> </w:t>
-      </w:r>
     </w:p>
     <w:p>
       <w:pPr>
+        <w:jc w:val="both"/>
         <w:rPr>
           <w:rFonts w:eastAsia="Times New Roman"/>
           <w:b/>
@@ -29333,6 +29514,7 @@
     </w:p>
     <w:p>
       <w:pPr>
+        <w:jc w:val="both"/>
         <w:rPr>
           <w:rFonts w:eastAsia="Times New Roman"/>
           <w:b/>
@@ -29346,6 +29528,7 @@
     </w:p>
     <w:p>
       <w:pPr>
+        <w:jc w:val="both"/>
         <w:rPr>
           <w:rFonts w:eastAsiaTheme="minorEastAsia"/>
           <w:sz w:val="18"/>
@@ -29490,6 +29673,7 @@
     <w:p>
       <w:pPr>
         <w:spacing w:before="100" w:beforeAutospacing="1" w:after="100" w:afterAutospacing="1" w:line="240" w:lineRule="auto"/>
+        <w:jc w:val="both"/>
         <w:rPr>
           <w:rFonts w:eastAsia="Times New Roman"/>
           <w:bCs w:val="0"/>
@@ -29597,6 +29781,7 @@
     <w:p>
       <w:pPr>
         <w:spacing w:before="100" w:beforeAutospacing="1" w:after="100" w:afterAutospacing="1" w:line="240" w:lineRule="auto"/>
+        <w:jc w:val="both"/>
         <w:rPr>
           <w:rFonts w:eastAsia="Times New Roman"/>
           <w:b/>
@@ -29715,6 +29900,7 @@
     <w:p>
       <w:pPr>
         <w:spacing w:before="100" w:beforeAutospacing="1" w:after="100" w:afterAutospacing="1" w:line="240" w:lineRule="auto"/>
+        <w:jc w:val="both"/>
         <w:rPr>
           <w:rFonts w:eastAsia="Times New Roman"/>
           <w:b/>
@@ -31777,6 +31963,7 @@
     <w:p>
       <w:pPr>
         <w:spacing w:before="100" w:beforeAutospacing="1" w:after="100" w:afterAutospacing="1" w:line="240" w:lineRule="auto"/>
+        <w:jc w:val="both"/>
         <w:rPr>
           <w:rFonts w:eastAsia="Times New Roman"/>
           <w:bCs w:val="0"/>
@@ -31791,6 +31978,7 @@
     <w:p>
       <w:pPr>
         <w:spacing w:before="100" w:beforeAutospacing="1" w:after="100" w:afterAutospacing="1" w:line="240" w:lineRule="auto"/>
+        <w:jc w:val="both"/>
         <w:rPr>
           <w:rFonts w:eastAsia="Times New Roman"/>
           <w:bCs w:val="0"/>
@@ -31805,6 +31993,7 @@
     <w:p>
       <w:pPr>
         <w:spacing w:before="100" w:beforeAutospacing="1" w:after="100" w:afterAutospacing="1" w:line="240" w:lineRule="auto"/>
+        <w:jc w:val="both"/>
         <w:rPr>
           <w:rFonts w:eastAsia="Times New Roman"/>
           <w:bCs w:val="0"/>
@@ -31819,76 +32008,17 @@
     <w:p>
       <w:pPr>
         <w:spacing w:before="100" w:beforeAutospacing="1" w:after="100" w:afterAutospacing="1" w:line="240" w:lineRule="auto"/>
+        <w:jc w:val="both"/>
         <w:rPr>
-          <w:rFonts w:eastAsia="Times New Roman"/>
+          <w:b/>
           <w:bCs w:val="0"/>
-          <w:iCs w:val="0"/>
-          <w:kern w:val="0"/>
-          <w:szCs w:val="24"/>
-          <w:lang w:eastAsia="en-IN"/>
-          <w14:ligatures w14:val="none"/>
         </w:rPr>
       </w:pPr>
     </w:p>
     <w:p>
       <w:pPr>
         <w:spacing w:before="100" w:beforeAutospacing="1" w:after="100" w:afterAutospacing="1" w:line="240" w:lineRule="auto"/>
-        <w:rPr>
-          <w:rFonts w:eastAsia="Times New Roman"/>
-          <w:bCs w:val="0"/>
-          <w:iCs w:val="0"/>
-          <w:kern w:val="0"/>
-          <w:szCs w:val="24"/>
-          <w:lang w:eastAsia="en-IN"/>
-          <w14:ligatures w14:val="none"/>
-        </w:rPr>
-      </w:pPr>
-    </w:p>
-    <w:p>
-      <w:pPr>
-        <w:spacing w:before="100" w:beforeAutospacing="1" w:after="100" w:afterAutospacing="1" w:line="240" w:lineRule="auto"/>
-        <w:rPr>
-          <w:rFonts w:eastAsia="Times New Roman"/>
-          <w:bCs w:val="0"/>
-          <w:iCs w:val="0"/>
-          <w:kern w:val="0"/>
-          <w:szCs w:val="24"/>
-          <w:lang w:eastAsia="en-IN"/>
-          <w14:ligatures w14:val="none"/>
-        </w:rPr>
-      </w:pPr>
-    </w:p>
-    <w:p>
-      <w:pPr>
-        <w:spacing w:before="100" w:beforeAutospacing="1" w:after="100" w:afterAutospacing="1" w:line="240" w:lineRule="auto"/>
-        <w:rPr>
-          <w:rFonts w:eastAsia="Times New Roman"/>
-          <w:bCs w:val="0"/>
-          <w:iCs w:val="0"/>
-          <w:kern w:val="0"/>
-          <w:szCs w:val="24"/>
-          <w:lang w:eastAsia="en-IN"/>
-          <w14:ligatures w14:val="none"/>
-        </w:rPr>
-      </w:pPr>
-    </w:p>
-    <w:p>
-      <w:pPr>
-        <w:spacing w:before="100" w:beforeAutospacing="1" w:after="100" w:afterAutospacing="1" w:line="240" w:lineRule="auto"/>
-        <w:rPr>
-          <w:rFonts w:eastAsia="Times New Roman"/>
-          <w:bCs w:val="0"/>
-          <w:iCs w:val="0"/>
-          <w:kern w:val="0"/>
-          <w:szCs w:val="24"/>
-          <w:lang w:eastAsia="en-IN"/>
-          <w14:ligatures w14:val="none"/>
-        </w:rPr>
-      </w:pPr>
-    </w:p>
-    <w:p>
-      <w:pPr>
-        <w:spacing w:before="100" w:beforeAutospacing="1" w:after="100" w:afterAutospacing="1" w:line="240" w:lineRule="auto"/>
+        <w:jc w:val="both"/>
         <w:rPr>
           <w:b/>
           <w:bCs w:val="0"/>
@@ -31948,7 +32078,7 @@
           <w:p>
             <w:pPr>
               <w:spacing w:after="0" w:line="240" w:lineRule="auto"/>
-              <w:jc w:val="center"/>
+              <w:jc w:val="both"/>
               <w:rPr>
                 <w:rFonts w:eastAsia="Times New Roman"/>
                 <w:b/>
@@ -31982,7 +32112,7 @@
           <w:p>
             <w:pPr>
               <w:spacing w:after="0" w:line="240" w:lineRule="auto"/>
-              <w:jc w:val="center"/>
+              <w:jc w:val="both"/>
               <w:rPr>
                 <w:rFonts w:eastAsia="Times New Roman"/>
                 <w:b/>
@@ -32016,7 +32146,7 @@
           <w:p>
             <w:pPr>
               <w:spacing w:after="0" w:line="240" w:lineRule="auto"/>
-              <w:jc w:val="center"/>
+              <w:jc w:val="both"/>
               <w:rPr>
                 <w:rFonts w:eastAsia="Times New Roman"/>
                 <w:b/>
@@ -32050,7 +32180,7 @@
           <w:p>
             <w:pPr>
               <w:spacing w:after="0" w:line="240" w:lineRule="auto"/>
-              <w:jc w:val="center"/>
+              <w:jc w:val="both"/>
               <w:rPr>
                 <w:rFonts w:eastAsia="Times New Roman"/>
                 <w:b/>
@@ -32084,7 +32214,7 @@
           <w:p>
             <w:pPr>
               <w:spacing w:after="0" w:line="240" w:lineRule="auto"/>
-              <w:jc w:val="center"/>
+              <w:jc w:val="both"/>
               <w:rPr>
                 <w:rFonts w:eastAsia="Times New Roman"/>
                 <w:b/>
@@ -32125,6 +32255,7 @@
           <w:p>
             <w:pPr>
               <w:spacing w:after="0" w:line="240" w:lineRule="auto"/>
+              <w:jc w:val="center"/>
               <w:rPr>
                 <w:rFonts w:eastAsia="Times New Roman"/>
                 <w:bCs w:val="0"/>
@@ -32158,6 +32289,7 @@
           <w:p>
             <w:pPr>
               <w:spacing w:after="0" w:line="240" w:lineRule="auto"/>
+              <w:jc w:val="center"/>
               <w:rPr>
                 <w:rFonts w:eastAsia="Times New Roman"/>
                 <w:bCs w:val="0"/>
@@ -32191,6 +32323,7 @@
           <w:p>
             <w:pPr>
               <w:spacing w:after="0" w:line="240" w:lineRule="auto"/>
+              <w:jc w:val="center"/>
               <w:rPr>
                 <w:rFonts w:eastAsia="Times New Roman"/>
                 <w:bCs w:val="0"/>
@@ -32224,6 +32357,7 @@
           <w:p>
             <w:pPr>
               <w:spacing w:after="0" w:line="240" w:lineRule="auto"/>
+              <w:jc w:val="center"/>
               <w:rPr>
                 <w:rFonts w:eastAsia="Times New Roman"/>
                 <w:bCs w:val="0"/>
@@ -32257,6 +32391,7 @@
           <w:p>
             <w:pPr>
               <w:spacing w:after="0" w:line="240" w:lineRule="auto"/>
+              <w:jc w:val="both"/>
               <w:rPr>
                 <w:rFonts w:eastAsia="Times New Roman"/>
                 <w:bCs w:val="0"/>
@@ -32297,6 +32432,7 @@
           <w:p>
             <w:pPr>
               <w:spacing w:after="0" w:line="240" w:lineRule="auto"/>
+              <w:jc w:val="center"/>
               <w:rPr>
                 <w:rFonts w:eastAsia="Times New Roman"/>
                 <w:bCs w:val="0"/>
@@ -32330,6 +32466,7 @@
           <w:p>
             <w:pPr>
               <w:spacing w:after="0" w:line="240" w:lineRule="auto"/>
+              <w:jc w:val="center"/>
               <w:rPr>
                 <w:rFonts w:eastAsia="Times New Roman"/>
                 <w:bCs w:val="0"/>
@@ -32363,6 +32500,7 @@
           <w:p>
             <w:pPr>
               <w:spacing w:after="0" w:line="240" w:lineRule="auto"/>
+              <w:jc w:val="center"/>
               <w:rPr>
                 <w:rFonts w:eastAsia="Times New Roman"/>
                 <w:bCs w:val="0"/>
@@ -32396,6 +32534,7 @@
           <w:p>
             <w:pPr>
               <w:spacing w:after="0" w:line="240" w:lineRule="auto"/>
+              <w:jc w:val="center"/>
               <w:rPr>
                 <w:rFonts w:eastAsia="Times New Roman"/>
                 <w:bCs w:val="0"/>
@@ -32429,6 +32568,7 @@
           <w:p>
             <w:pPr>
               <w:spacing w:after="0" w:line="240" w:lineRule="auto"/>
+              <w:jc w:val="both"/>
               <w:rPr>
                 <w:rFonts w:eastAsia="Times New Roman"/>
                 <w:bCs w:val="0"/>
@@ -32469,6 +32609,7 @@
           <w:p>
             <w:pPr>
               <w:spacing w:after="0" w:line="240" w:lineRule="auto"/>
+              <w:jc w:val="center"/>
               <w:rPr>
                 <w:rFonts w:eastAsia="Times New Roman"/>
                 <w:bCs w:val="0"/>
@@ -32502,6 +32643,7 @@
           <w:p>
             <w:pPr>
               <w:spacing w:after="0" w:line="240" w:lineRule="auto"/>
+              <w:jc w:val="center"/>
               <w:rPr>
                 <w:rFonts w:eastAsia="Times New Roman"/>
                 <w:bCs w:val="0"/>
@@ -32535,6 +32677,7 @@
           <w:p>
             <w:pPr>
               <w:spacing w:after="0" w:line="240" w:lineRule="auto"/>
+              <w:jc w:val="center"/>
               <w:rPr>
                 <w:rFonts w:eastAsia="Times New Roman"/>
                 <w:bCs w:val="0"/>
@@ -32568,6 +32711,7 @@
           <w:p>
             <w:pPr>
               <w:spacing w:after="0" w:line="240" w:lineRule="auto"/>
+              <w:jc w:val="center"/>
               <w:rPr>
                 <w:rFonts w:eastAsia="Times New Roman"/>
                 <w:bCs w:val="0"/>
@@ -32601,6 +32745,7 @@
           <w:p>
             <w:pPr>
               <w:spacing w:after="0" w:line="240" w:lineRule="auto"/>
+              <w:jc w:val="both"/>
               <w:rPr>
                 <w:rFonts w:eastAsia="Times New Roman"/>
                 <w:bCs w:val="0"/>
@@ -32641,6 +32786,7 @@
           <w:p>
             <w:pPr>
               <w:spacing w:after="0" w:line="240" w:lineRule="auto"/>
+              <w:jc w:val="center"/>
               <w:rPr>
                 <w:rFonts w:eastAsia="Times New Roman"/>
                 <w:bCs w:val="0"/>
@@ -32674,6 +32820,7 @@
           <w:p>
             <w:pPr>
               <w:spacing w:after="0" w:line="240" w:lineRule="auto"/>
+              <w:jc w:val="center"/>
               <w:rPr>
                 <w:rFonts w:eastAsia="Times New Roman"/>
                 <w:bCs w:val="0"/>
@@ -32707,6 +32854,7 @@
           <w:p>
             <w:pPr>
               <w:spacing w:after="0" w:line="240" w:lineRule="auto"/>
+              <w:jc w:val="center"/>
               <w:rPr>
                 <w:rFonts w:eastAsia="Times New Roman"/>
                 <w:bCs w:val="0"/>
@@ -32740,6 +32888,7 @@
           <w:p>
             <w:pPr>
               <w:spacing w:after="0" w:line="240" w:lineRule="auto"/>
+              <w:jc w:val="center"/>
               <w:rPr>
                 <w:rFonts w:eastAsia="Times New Roman"/>
                 <w:bCs w:val="0"/>
@@ -32773,6 +32922,7 @@
           <w:p>
             <w:pPr>
               <w:spacing w:after="0" w:line="240" w:lineRule="auto"/>
+              <w:jc w:val="both"/>
               <w:rPr>
                 <w:rFonts w:eastAsia="Times New Roman"/>
                 <w:bCs w:val="0"/>
@@ -32802,6 +32952,7 @@
     <w:p>
       <w:pPr>
         <w:spacing w:before="100" w:beforeAutospacing="1" w:after="100" w:afterAutospacing="1" w:line="240" w:lineRule="auto"/>
+        <w:jc w:val="both"/>
         <w:outlineLvl w:val="2"/>
         <w:rPr>
           <w:rFonts w:eastAsia="Times New Roman"/>
@@ -32831,6 +32982,7 @@
     <w:p>
       <w:pPr>
         <w:spacing w:before="100" w:beforeAutospacing="1" w:after="100" w:afterAutospacing="1" w:line="240" w:lineRule="auto"/>
+        <w:jc w:val="both"/>
         <w:rPr>
           <w:rFonts w:eastAsia="Times New Roman"/>
           <w:bCs w:val="0"/>
@@ -32912,7 +33064,7 @@
           <w:p>
             <w:pPr>
               <w:spacing w:after="0" w:line="240" w:lineRule="auto"/>
-              <w:jc w:val="center"/>
+              <w:jc w:val="both"/>
               <w:rPr>
                 <w:rFonts w:eastAsia="Times New Roman"/>
                 <w:b/>
@@ -32946,7 +33098,7 @@
           <w:p>
             <w:pPr>
               <w:spacing w:after="0" w:line="240" w:lineRule="auto"/>
-              <w:jc w:val="right"/>
+              <w:jc w:val="both"/>
               <w:rPr>
                 <w:rFonts w:eastAsia="Times New Roman"/>
                 <w:b/>
@@ -32986,7 +33138,7 @@
           <w:p>
             <w:pPr>
               <w:spacing w:after="0" w:line="240" w:lineRule="auto"/>
-              <w:jc w:val="center"/>
+              <w:jc w:val="both"/>
               <w:rPr>
                 <w:rFonts w:eastAsia="Times New Roman"/>
                 <w:bCs w:val="0"/>
@@ -33020,7 +33172,7 @@
           <w:p>
             <w:pPr>
               <w:spacing w:after="0" w:line="240" w:lineRule="auto"/>
-              <w:jc w:val="center"/>
+              <w:jc w:val="both"/>
               <w:rPr>
                 <w:rFonts w:eastAsia="Times New Roman"/>
                 <w:bCs w:val="0"/>
@@ -33060,7 +33212,7 @@
           <w:p>
             <w:pPr>
               <w:spacing w:after="0" w:line="240" w:lineRule="auto"/>
-              <w:jc w:val="center"/>
+              <w:jc w:val="both"/>
               <w:rPr>
                 <w:rFonts w:eastAsia="Times New Roman"/>
                 <w:bCs w:val="0"/>
@@ -33094,7 +33246,7 @@
           <w:p>
             <w:pPr>
               <w:spacing w:after="0" w:line="240" w:lineRule="auto"/>
-              <w:jc w:val="center"/>
+              <w:jc w:val="both"/>
               <w:rPr>
                 <w:rFonts w:eastAsia="Times New Roman"/>
                 <w:bCs w:val="0"/>
@@ -33134,7 +33286,7 @@
           <w:p>
             <w:pPr>
               <w:spacing w:after="0" w:line="240" w:lineRule="auto"/>
-              <w:jc w:val="center"/>
+              <w:jc w:val="both"/>
               <w:rPr>
                 <w:rFonts w:eastAsia="Times New Roman"/>
                 <w:bCs w:val="0"/>
@@ -33168,7 +33320,7 @@
           <w:p>
             <w:pPr>
               <w:spacing w:after="0" w:line="240" w:lineRule="auto"/>
-              <w:jc w:val="center"/>
+              <w:jc w:val="both"/>
               <w:rPr>
                 <w:rFonts w:eastAsia="Times New Roman"/>
                 <w:bCs w:val="0"/>
@@ -33208,7 +33360,7 @@
           <w:p>
             <w:pPr>
               <w:spacing w:after="0" w:line="240" w:lineRule="auto"/>
-              <w:jc w:val="center"/>
+              <w:jc w:val="both"/>
               <w:rPr>
                 <w:rFonts w:eastAsia="Times New Roman"/>
                 <w:bCs w:val="0"/>
@@ -33242,7 +33394,7 @@
           <w:p>
             <w:pPr>
               <w:spacing w:after="0" w:line="240" w:lineRule="auto"/>
-              <w:jc w:val="center"/>
+              <w:jc w:val="both"/>
               <w:rPr>
                 <w:rFonts w:eastAsia="Times New Roman"/>
                 <w:bCs w:val="0"/>
@@ -33272,6 +33424,7 @@
     <w:p>
       <w:pPr>
         <w:spacing w:before="100" w:beforeAutospacing="1" w:after="100" w:afterAutospacing="1" w:line="240" w:lineRule="auto"/>
+        <w:jc w:val="both"/>
         <w:outlineLvl w:val="2"/>
         <w:rPr>
           <w:rFonts w:eastAsia="Times New Roman"/>
@@ -33301,6 +33454,7 @@
     <w:p>
       <w:pPr>
         <w:spacing w:before="100" w:beforeAutospacing="1" w:after="100" w:afterAutospacing="1" w:line="240" w:lineRule="auto"/>
+        <w:jc w:val="both"/>
         <w:rPr>
           <w:rFonts w:eastAsia="Times New Roman"/>
           <w:bCs w:val="0"/>

</xml_diff>